<commit_message>
Step by Step Log
</commit_message>
<xml_diff>
--- a/EXPERIMENT 2/Experiment 2_POWER BI.docx
+++ b/EXPERIMENT 2/Experiment 2_POWER BI.docx
@@ -6,7 +6,7 @@
       <w:pPr>
         <w:pStyle w:val="Heading1"/>
         <w:rPr>
-          <w:rFonts w:asciiTheme="minorHAnsi" w:hAnsiTheme="minorHAnsi" w:cstheme="minorHAnsi"/>
+          <w:rFonts w:ascii="Times New Roman" w:hAnsi="Times New Roman" w:cs="Times New Roman"/>
           <w:b/>
           <w:bCs/>
           <w:color w:val="000000" w:themeColor="text1"/>
@@ -14,52 +14,45 @@
       </w:pPr>
       <w:r>
         <w:rPr>
+          <w:rFonts w:ascii="Times New Roman" w:hAnsi="Times New Roman" w:cs="Times New Roman"/>
           <w:b/>
           <w:bCs/>
           <w:color w:val="000000" w:themeColor="text1"/>
         </w:rPr>
-        <w:t xml:space="preserve">                                         </w:t>
-      </w:r>
-      <w:r>
-        <w:rPr>
-          <w:rFonts w:asciiTheme="minorHAnsi" w:hAnsiTheme="minorHAnsi" w:cstheme="minorHAnsi"/>
+        <w:t xml:space="preserve">                                         EXPERIM</w:t>
+      </w:r>
+      <w:r>
+        <w:rPr>
+          <w:rFonts w:ascii="Times New Roman" w:hAnsi="Times New Roman" w:cs="Times New Roman"/>
           <w:b/>
           <w:bCs/>
           <w:color w:val="000000" w:themeColor="text1"/>
         </w:rPr>
-        <w:t>EXPERIM</w:t>
-      </w:r>
-      <w:r>
-        <w:rPr>
-          <w:rFonts w:asciiTheme="minorHAnsi" w:hAnsiTheme="minorHAnsi" w:cstheme="minorHAnsi"/>
+        <w:t>EN</w:t>
+      </w:r>
+      <w:r>
+        <w:rPr>
+          <w:rFonts w:ascii="Times New Roman" w:hAnsi="Times New Roman" w:cs="Times New Roman"/>
           <w:b/>
           <w:bCs/>
           <w:color w:val="000000" w:themeColor="text1"/>
         </w:rPr>
-        <w:t>EN</w:t>
-      </w:r>
-      <w:r>
-        <w:rPr>
-          <w:rFonts w:asciiTheme="minorHAnsi" w:hAnsiTheme="minorHAnsi" w:cstheme="minorHAnsi"/>
+        <w:t>T  2</w:t>
+      </w:r>
+    </w:p>
+    <w:p>
+      <w:pPr>
+        <w:pStyle w:val="Heading1"/>
+        <w:rPr>
+          <w:rFonts w:ascii="Times New Roman" w:hAnsi="Times New Roman" w:cs="Times New Roman"/>
           <w:b/>
           <w:bCs/>
           <w:color w:val="000000" w:themeColor="text1"/>
         </w:rPr>
-        <w:t>T  2</w:t>
-      </w:r>
-    </w:p>
-    <w:p>
-      <w:pPr>
-        <w:pStyle w:val="Heading1"/>
-        <w:rPr>
-          <w:b/>
-          <w:bCs/>
-          <w:color w:val="000000" w:themeColor="text1"/>
-        </w:rPr>
-      </w:pPr>
-      <w:r>
-        <w:rPr>
-          <w:rFonts w:asciiTheme="minorHAnsi" w:hAnsiTheme="minorHAnsi" w:cstheme="minorHAnsi"/>
+      </w:pPr>
+      <w:r>
+        <w:rPr>
+          <w:rFonts w:ascii="Times New Roman" w:hAnsi="Times New Roman" w:cs="Times New Roman"/>
           <w:b/>
           <w:bCs/>
           <w:color w:val="000000" w:themeColor="text1"/>
@@ -70,7 +63,7 @@
       </w:r>
       <w:r>
         <w:rPr>
-          <w:rFonts w:asciiTheme="minorHAnsi" w:hAnsiTheme="minorHAnsi" w:cstheme="minorHAnsi"/>
+          <w:rFonts w:ascii="Times New Roman" w:hAnsi="Times New Roman" w:cs="Times New Roman"/>
           <w:b/>
           <w:bCs/>
           <w:color w:val="000000" w:themeColor="text1"/>
@@ -82,7 +75,7 @@
       </w:r>
       <w:r>
         <w:rPr>
-          <w:rFonts w:asciiTheme="minorHAnsi" w:hAnsiTheme="minorHAnsi" w:cstheme="minorHAnsi"/>
+          <w:rFonts w:ascii="Times New Roman" w:hAnsi="Times New Roman" w:cs="Times New Roman"/>
           <w:b/>
           <w:bCs/>
           <w:color w:val="000000" w:themeColor="text1"/>
@@ -93,7 +86,7 @@
       </w:r>
       <w:r>
         <w:rPr>
-          <w:rFonts w:asciiTheme="minorHAnsi" w:hAnsiTheme="minorHAnsi" w:cstheme="minorHAnsi"/>
+          <w:rFonts w:ascii="Times New Roman" w:hAnsi="Times New Roman" w:cs="Times New Roman"/>
           <w:b/>
           <w:bCs/>
           <w:color w:val="000000" w:themeColor="text1"/>
@@ -105,6 +98,7 @@
       </w:r>
       <w:r>
         <w:rPr>
+          <w:rFonts w:ascii="Times New Roman" w:hAnsi="Times New Roman" w:cs="Times New Roman"/>
           <w:b/>
           <w:bCs/>
           <w:color w:val="000000" w:themeColor="text1"/>
@@ -113,6 +107,7 @@
       </w:r>
       <w:r>
         <w:rPr>
+          <w:rFonts w:ascii="Times New Roman" w:hAnsi="Times New Roman" w:cs="Times New Roman"/>
           <w:b/>
           <w:bCs/>
           <w:color w:val="000000" w:themeColor="text1"/>
@@ -121,6 +116,7 @@
       </w:r>
       <w:r>
         <w:rPr>
+          <w:rFonts w:ascii="Times New Roman" w:hAnsi="Times New Roman" w:cs="Times New Roman"/>
           <w:b/>
           <w:bCs/>
           <w:color w:val="000000" w:themeColor="text1"/>
@@ -136,6 +132,7 @@
           <w:numId w:val="1"/>
         </w:numPr>
         <w:rPr>
+          <w:rFonts w:ascii="Times New Roman" w:hAnsi="Times New Roman" w:cs="Times New Roman"/>
           <w:b/>
           <w:bCs/>
           <w:sz w:val="28"/>
@@ -145,6 +142,7 @@
       </w:pPr>
       <w:r>
         <w:rPr>
+          <w:rFonts w:ascii="Times New Roman" w:hAnsi="Times New Roman" w:cs="Times New Roman"/>
           <w:b/>
           <w:bCs/>
           <w:sz w:val="28"/>
@@ -155,6 +153,7 @@
       </w:r>
       <w:r>
         <w:rPr>
+          <w:rFonts w:ascii="Times New Roman" w:hAnsi="Times New Roman" w:cs="Times New Roman"/>
           <w:b/>
           <w:bCs/>
           <w:sz w:val="28"/>
@@ -167,14 +166,21 @@
     <w:p>
       <w:pPr>
         <w:pStyle w:val="ListParagraph"/>
-      </w:pPr>
-      <w:r>
+        <w:rPr>
+          <w:rFonts w:ascii="Times New Roman" w:hAnsi="Times New Roman" w:cs="Times New Roman"/>
+        </w:rPr>
+      </w:pPr>
+      <w:r>
+        <w:rPr>
+          <w:rFonts w:ascii="Times New Roman" w:hAnsi="Times New Roman" w:cs="Times New Roman"/>
+        </w:rPr>
         <w:t>To design and implement an end-to-end ETL (Extract, Transform, Load) pipeline using Microsoft Power BI's Power Query Editor, enabling the extraction of data from a real-world business dataset, application of transformation logic, and loading of cleansed data into a unified analytical model for reporting and decision-making.</w:t>
       </w:r>
     </w:p>
     <w:p>
       <w:pPr>
         <w:rPr>
+          <w:rFonts w:ascii="Times New Roman" w:hAnsi="Times New Roman" w:cs="Times New Roman"/>
           <w:b/>
           <w:bCs/>
         </w:rPr>
@@ -188,6 +194,7 @@
           <w:numId w:val="1"/>
         </w:numPr>
         <w:rPr>
+          <w:rFonts w:ascii="Times New Roman" w:hAnsi="Times New Roman" w:cs="Times New Roman"/>
           <w:b/>
           <w:bCs/>
           <w:sz w:val="28"/>
@@ -197,6 +204,7 @@
       </w:pPr>
       <w:r>
         <w:rPr>
+          <w:rFonts w:ascii="Times New Roman" w:hAnsi="Times New Roman" w:cs="Times New Roman"/>
           <w:b/>
           <w:bCs/>
           <w:sz w:val="28"/>
@@ -214,8 +222,14 @@
           <w:numId w:val="13"/>
         </w:numPr>
         <w:ind w:left="1080"/>
-      </w:pPr>
-      <w:r>
+        <w:rPr>
+          <w:rFonts w:ascii="Times New Roman" w:hAnsi="Times New Roman" w:cs="Times New Roman"/>
+        </w:rPr>
+      </w:pPr>
+      <w:r>
+        <w:rPr>
+          <w:rFonts w:ascii="Times New Roman" w:hAnsi="Times New Roman" w:cs="Times New Roman"/>
+        </w:rPr>
         <w:t>To understand the ETL process and its role in Business Intelligence.</w:t>
       </w:r>
     </w:p>
@@ -227,8 +241,14 @@
           <w:numId w:val="13"/>
         </w:numPr>
         <w:ind w:left="1080"/>
-      </w:pPr>
-      <w:r>
+        <w:rPr>
+          <w:rFonts w:ascii="Times New Roman" w:hAnsi="Times New Roman" w:cs="Times New Roman"/>
+        </w:rPr>
+      </w:pPr>
+      <w:r>
+        <w:rPr>
+          <w:rFonts w:ascii="Times New Roman" w:hAnsi="Times New Roman" w:cs="Times New Roman"/>
+        </w:rPr>
         <w:t>To extract data from the Global Superstore dataset using Microsoft Power BI.</w:t>
       </w:r>
     </w:p>
@@ -240,8 +260,14 @@
           <w:numId w:val="13"/>
         </w:numPr>
         <w:ind w:left="1080"/>
-      </w:pPr>
-      <w:r>
+        <w:rPr>
+          <w:rFonts w:ascii="Times New Roman" w:hAnsi="Times New Roman" w:cs="Times New Roman"/>
+        </w:rPr>
+      </w:pPr>
+      <w:r>
+        <w:rPr>
+          <w:rFonts w:ascii="Times New Roman" w:hAnsi="Times New Roman" w:cs="Times New Roman"/>
+        </w:rPr>
         <w:t>To clean, transform, standardize, and integrate data using Power Query Editor.</w:t>
       </w:r>
     </w:p>
@@ -253,8 +279,14 @@
           <w:numId w:val="13"/>
         </w:numPr>
         <w:ind w:left="1080"/>
-      </w:pPr>
-      <w:r>
+        <w:rPr>
+          <w:rFonts w:ascii="Times New Roman" w:hAnsi="Times New Roman" w:cs="Times New Roman"/>
+        </w:rPr>
+      </w:pPr>
+      <w:r>
+        <w:rPr>
+          <w:rFonts w:ascii="Times New Roman" w:hAnsi="Times New Roman" w:cs="Times New Roman"/>
+        </w:rPr>
         <w:t>To create relationships between multiple tables in the Power BI data model.</w:t>
       </w:r>
     </w:p>
@@ -266,8 +298,14 @@
           <w:numId w:val="13"/>
         </w:numPr>
         <w:ind w:left="1080"/>
-      </w:pPr>
-      <w:r>
+        <w:rPr>
+          <w:rFonts w:ascii="Times New Roman" w:hAnsi="Times New Roman" w:cs="Times New Roman"/>
+        </w:rPr>
+      </w:pPr>
+      <w:r>
+        <w:rPr>
+          <w:rFonts w:ascii="Times New Roman" w:hAnsi="Times New Roman" w:cs="Times New Roman"/>
+        </w:rPr>
         <w:t>To create analytical measures using DAX.</w:t>
       </w:r>
     </w:p>
@@ -280,11 +318,15 @@
         </w:numPr>
         <w:ind w:left="1080"/>
         <w:rPr>
+          <w:rFonts w:ascii="Times New Roman" w:hAnsi="Times New Roman" w:cs="Times New Roman"/>
           <w:b/>
           <w:bCs/>
         </w:rPr>
       </w:pPr>
       <w:r>
+        <w:rPr>
+          <w:rFonts w:ascii="Times New Roman" w:hAnsi="Times New Roman" w:cs="Times New Roman"/>
+        </w:rPr>
         <w:t>To prepare the transformed data for reporting and business analysis.</w:t>
       </w:r>
     </w:p>
@@ -293,6 +335,7 @@
         <w:pStyle w:val="ListParagraph"/>
         <w:ind w:left="1080"/>
         <w:rPr>
+          <w:rFonts w:ascii="Times New Roman" w:hAnsi="Times New Roman" w:cs="Times New Roman"/>
           <w:b/>
           <w:bCs/>
         </w:rPr>
@@ -306,6 +349,7 @@
           <w:numId w:val="1"/>
         </w:numPr>
         <w:rPr>
+          <w:rFonts w:ascii="Times New Roman" w:hAnsi="Times New Roman" w:cs="Times New Roman"/>
           <w:b/>
           <w:bCs/>
           <w:sz w:val="28"/>
@@ -315,6 +359,7 @@
       </w:pPr>
       <w:r>
         <w:rPr>
+          <w:rFonts w:ascii="Times New Roman" w:hAnsi="Times New Roman" w:cs="Times New Roman"/>
           <w:b/>
           <w:bCs/>
           <w:sz w:val="28"/>
@@ -332,8 +377,14 @@
           <w:numId w:val="14"/>
         </w:numPr>
         <w:ind w:left="1080"/>
-      </w:pPr>
-      <w:r>
+        <w:rPr>
+          <w:rFonts w:ascii="Times New Roman" w:hAnsi="Times New Roman" w:cs="Times New Roman"/>
+        </w:rPr>
+      </w:pPr>
+      <w:r>
+        <w:rPr>
+          <w:rFonts w:ascii="Times New Roman" w:hAnsi="Times New Roman" w:cs="Times New Roman"/>
+        </w:rPr>
         <w:t>Microsoft Power BI Desktop</w:t>
       </w:r>
     </w:p>
@@ -345,8 +396,14 @@
           <w:numId w:val="14"/>
         </w:numPr>
         <w:ind w:left="1080"/>
-      </w:pPr>
-      <w:r>
+        <w:rPr>
+          <w:rFonts w:ascii="Times New Roman" w:hAnsi="Times New Roman" w:cs="Times New Roman"/>
+        </w:rPr>
+      </w:pPr>
+      <w:r>
+        <w:rPr>
+          <w:rFonts w:ascii="Times New Roman" w:hAnsi="Times New Roman" w:cs="Times New Roman"/>
+        </w:rPr>
         <w:t>Global Superstore Dataset.xlsx</w:t>
       </w:r>
     </w:p>
@@ -358,8 +415,14 @@
           <w:numId w:val="14"/>
         </w:numPr>
         <w:ind w:left="1080"/>
-      </w:pPr>
-      <w:r>
+        <w:rPr>
+          <w:rFonts w:ascii="Times New Roman" w:hAnsi="Times New Roman" w:cs="Times New Roman"/>
+        </w:rPr>
+      </w:pPr>
+      <w:r>
+        <w:rPr>
+          <w:rFonts w:ascii="Times New Roman" w:hAnsi="Times New Roman" w:cs="Times New Roman"/>
+        </w:rPr>
         <w:t>Power Query Editor – built into Power BI Desktop</w:t>
       </w:r>
     </w:p>
@@ -372,11 +435,15 @@
         </w:numPr>
         <w:ind w:left="1080"/>
         <w:rPr>
+          <w:rFonts w:ascii="Times New Roman" w:hAnsi="Times New Roman" w:cs="Times New Roman"/>
           <w:b/>
           <w:bCs/>
         </w:rPr>
       </w:pPr>
       <w:r>
+        <w:rPr>
+          <w:rFonts w:ascii="Times New Roman" w:hAnsi="Times New Roman" w:cs="Times New Roman"/>
+        </w:rPr>
         <w:t>DAX (Data Analysis Expressions)</w:t>
       </w:r>
     </w:p>
@@ -385,6 +452,7 @@
         <w:pStyle w:val="ListParagraph"/>
         <w:ind w:left="1080"/>
         <w:rPr>
+          <w:rFonts w:ascii="Times New Roman" w:hAnsi="Times New Roman" w:cs="Times New Roman"/>
           <w:b/>
           <w:bCs/>
         </w:rPr>
@@ -398,12 +466,14 @@
           <w:numId w:val="1"/>
         </w:numPr>
         <w:rPr>
+          <w:rFonts w:ascii="Times New Roman" w:hAnsi="Times New Roman" w:cs="Times New Roman"/>
           <w:b/>
           <w:bCs/>
         </w:rPr>
       </w:pPr>
       <w:r>
         <w:rPr>
+          <w:rFonts w:ascii="Times New Roman" w:hAnsi="Times New Roman" w:cs="Times New Roman"/>
           <w:b/>
           <w:bCs/>
           <w:sz w:val="28"/>
@@ -414,12 +484,16 @@
       </w:r>
       <w:r>
         <w:rPr>
+          <w:rFonts w:ascii="Times New Roman" w:hAnsi="Times New Roman" w:cs="Times New Roman"/>
           <w:b/>
           <w:bCs/>
         </w:rPr>
         <w:t xml:space="preserve"> </w:t>
       </w:r>
       <w:r>
+        <w:rPr>
+          <w:rFonts w:ascii="Times New Roman" w:hAnsi="Times New Roman" w:cs="Times New Roman"/>
+        </w:rPr>
         <w:t>Global Superstore Dataset.xlsx.</w:t>
       </w:r>
     </w:p>
@@ -427,6 +501,7 @@
       <w:pPr>
         <w:pStyle w:val="ListParagraph"/>
         <w:rPr>
+          <w:rFonts w:ascii="Times New Roman" w:hAnsi="Times New Roman" w:cs="Times New Roman"/>
           <w:b/>
           <w:bCs/>
         </w:rPr>
@@ -440,12 +515,14 @@
           <w:numId w:val="1"/>
         </w:numPr>
         <w:rPr>
+          <w:rFonts w:ascii="Times New Roman" w:hAnsi="Times New Roman" w:cs="Times New Roman"/>
           <w:sz w:val="28"/>
           <w:szCs w:val="28"/>
         </w:rPr>
       </w:pPr>
       <w:r>
         <w:rPr>
+          <w:rFonts w:ascii="Times New Roman" w:hAnsi="Times New Roman" w:cs="Times New Roman"/>
           <w:b/>
           <w:bCs/>
           <w:sz w:val="28"/>
@@ -464,12 +541,14 @@
         </w:numPr>
         <w:ind w:left="1080"/>
         <w:rPr>
+          <w:rFonts w:ascii="Times New Roman" w:hAnsi="Times New Roman" w:cs="Times New Roman"/>
           <w:sz w:val="28"/>
           <w:szCs w:val="28"/>
         </w:rPr>
       </w:pPr>
       <w:r>
         <w:rPr>
+          <w:rFonts w:ascii="Times New Roman" w:hAnsi="Times New Roman" w:cs="Times New Roman"/>
           <w:b/>
           <w:bCs/>
           <w:sz w:val="28"/>
@@ -479,6 +558,7 @@
       </w:r>
       <w:r>
         <w:rPr>
+          <w:rFonts w:ascii="Times New Roman" w:hAnsi="Times New Roman" w:cs="Times New Roman"/>
           <w:sz w:val="28"/>
           <w:szCs w:val="28"/>
         </w:rPr>
@@ -494,12 +574,14 @@
         </w:numPr>
         <w:ind w:left="1080"/>
         <w:rPr>
+          <w:rFonts w:ascii="Times New Roman" w:hAnsi="Times New Roman" w:cs="Times New Roman"/>
           <w:sz w:val="28"/>
           <w:szCs w:val="28"/>
         </w:rPr>
       </w:pPr>
       <w:r>
         <w:rPr>
+          <w:rFonts w:ascii="Times New Roman" w:hAnsi="Times New Roman" w:cs="Times New Roman"/>
           <w:b/>
           <w:bCs/>
           <w:sz w:val="28"/>
@@ -509,6 +591,7 @@
       </w:r>
       <w:r>
         <w:rPr>
+          <w:rFonts w:ascii="Times New Roman" w:hAnsi="Times New Roman" w:cs="Times New Roman"/>
           <w:sz w:val="28"/>
           <w:szCs w:val="28"/>
         </w:rPr>
@@ -524,12 +607,14 @@
         </w:numPr>
         <w:ind w:left="1080"/>
         <w:rPr>
+          <w:rFonts w:ascii="Times New Roman" w:hAnsi="Times New Roman" w:cs="Times New Roman"/>
           <w:sz w:val="28"/>
           <w:szCs w:val="28"/>
         </w:rPr>
       </w:pPr>
       <w:r>
         <w:rPr>
+          <w:rFonts w:ascii="Times New Roman" w:hAnsi="Times New Roman" w:cs="Times New Roman"/>
           <w:b/>
           <w:bCs/>
           <w:sz w:val="28"/>
@@ -539,6 +624,7 @@
       </w:r>
       <w:r>
         <w:rPr>
+          <w:rFonts w:ascii="Times New Roman" w:hAnsi="Times New Roman" w:cs="Times New Roman"/>
           <w:sz w:val="28"/>
           <w:szCs w:val="28"/>
         </w:rPr>
@@ -554,22 +640,24 @@
         </w:numPr>
         <w:ind w:left="1080"/>
         <w:rPr>
+          <w:rFonts w:ascii="Times New Roman" w:hAnsi="Times New Roman" w:cs="Times New Roman"/>
           <w:sz w:val="28"/>
           <w:szCs w:val="28"/>
         </w:rPr>
       </w:pPr>
       <w:r>
         <w:rPr>
+          <w:rFonts w:ascii="Times New Roman" w:hAnsi="Times New Roman" w:cs="Times New Roman"/>
           <w:b/>
           <w:bCs/>
           <w:sz w:val="28"/>
           <w:szCs w:val="28"/>
         </w:rPr>
-        <w:lastRenderedPageBreak/>
         <w:t>Load:</w:t>
       </w:r>
       <w:r>
         <w:rPr>
+          <w:rFonts w:ascii="Times New Roman" w:hAnsi="Times New Roman" w:cs="Times New Roman"/>
           <w:sz w:val="28"/>
           <w:szCs w:val="28"/>
         </w:rPr>
@@ -584,18 +672,24 @@
           <w:numId w:val="15"/>
         </w:numPr>
         <w:ind w:left="1080"/>
-      </w:pPr>
-      <w:r>
-        <w:rPr>
+        <w:rPr>
+          <w:rFonts w:ascii="Times New Roman" w:hAnsi="Times New Roman" w:cs="Times New Roman"/>
+        </w:rPr>
+      </w:pPr>
+      <w:r>
+        <w:rPr>
+          <w:rFonts w:ascii="Times New Roman" w:hAnsi="Times New Roman" w:cs="Times New Roman"/>
           <w:b/>
           <w:bCs/>
           <w:sz w:val="28"/>
           <w:szCs w:val="28"/>
         </w:rPr>
+        <w:lastRenderedPageBreak/>
         <w:t>Power Query Editor</w:t>
       </w:r>
       <w:r>
         <w:rPr>
+          <w:rFonts w:ascii="Times New Roman" w:hAnsi="Times New Roman" w:cs="Times New Roman"/>
           <w:sz w:val="28"/>
           <w:szCs w:val="28"/>
         </w:rPr>
@@ -610,6 +704,7 @@
           <w:numId w:val="1"/>
         </w:numPr>
         <w:rPr>
+          <w:rFonts w:ascii="Times New Roman" w:hAnsi="Times New Roman" w:cs="Times New Roman"/>
           <w:b/>
           <w:bCs/>
           <w:sz w:val="28"/>
@@ -619,6 +714,7 @@
       </w:pPr>
       <w:r>
         <w:rPr>
+          <w:rFonts w:ascii="Times New Roman" w:hAnsi="Times New Roman" w:cs="Times New Roman"/>
           <w:b/>
           <w:bCs/>
           <w:sz w:val="28"/>
@@ -632,6 +728,7 @@
       <w:pPr>
         <w:pStyle w:val="ListParagraph"/>
         <w:rPr>
+          <w:rFonts w:ascii="Times New Roman" w:hAnsi="Times New Roman" w:cs="Times New Roman"/>
           <w:b/>
           <w:bCs/>
           <w:sz w:val="26"/>
@@ -640,6 +737,7 @@
       </w:pPr>
       <w:r>
         <w:rPr>
+          <w:rFonts w:ascii="Times New Roman" w:hAnsi="Times New Roman" w:cs="Times New Roman"/>
           <w:b/>
           <w:bCs/>
           <w:sz w:val="26"/>
@@ -652,12 +750,14 @@
       <w:pPr>
         <w:pStyle w:val="ListParagraph"/>
         <w:rPr>
-          <w:sz w:val="26"/>
-          <w:szCs w:val="26"/>
-        </w:rPr>
-      </w:pPr>
-      <w:r>
-        <w:rPr>
+          <w:rFonts w:ascii="Times New Roman" w:hAnsi="Times New Roman" w:cs="Times New Roman"/>
+          <w:sz w:val="26"/>
+          <w:szCs w:val="26"/>
+        </w:rPr>
+      </w:pPr>
+      <w:r>
+        <w:rPr>
+          <w:rFonts w:ascii="Times New Roman" w:hAnsi="Times New Roman" w:cs="Times New Roman"/>
           <w:b/>
           <w:bCs/>
           <w:sz w:val="26"/>
@@ -667,6 +767,7 @@
       </w:r>
       <w:r>
         <w:rPr>
+          <w:rFonts w:ascii="Times New Roman" w:hAnsi="Times New Roman" w:cs="Times New Roman"/>
           <w:sz w:val="26"/>
           <w:szCs w:val="26"/>
         </w:rPr>
@@ -677,35 +778,32 @@
       <w:pPr>
         <w:pStyle w:val="ListParagraph"/>
         <w:rPr>
-          <w:sz w:val="26"/>
-          <w:szCs w:val="26"/>
-        </w:rPr>
-      </w:pPr>
-      <w:r>
-        <w:rPr>
-          <w:sz w:val="26"/>
-          <w:szCs w:val="26"/>
-        </w:rPr>
-        <w:t xml:space="preserve">             </w:t>
-      </w:r>
-      <w:r>
-        <w:rPr>
-          <w:sz w:val="26"/>
-          <w:szCs w:val="26"/>
-        </w:rPr>
-        <w:t>Download the Global Superstore Dataset.xlsx file and save it in the experiment folder.</w:t>
-      </w:r>
-    </w:p>
-    <w:p>
-      <w:pPr>
-        <w:pStyle w:val="ListParagraph"/>
-        <w:rPr>
-          <w:sz w:val="26"/>
-          <w:szCs w:val="26"/>
-        </w:rPr>
-      </w:pPr>
-      <w:r>
-        <w:rPr>
+          <w:rFonts w:ascii="Times New Roman" w:hAnsi="Times New Roman" w:cs="Times New Roman"/>
+          <w:sz w:val="26"/>
+          <w:szCs w:val="26"/>
+        </w:rPr>
+      </w:pPr>
+      <w:r>
+        <w:rPr>
+          <w:rFonts w:ascii="Times New Roman" w:hAnsi="Times New Roman" w:cs="Times New Roman"/>
+          <w:sz w:val="26"/>
+          <w:szCs w:val="26"/>
+        </w:rPr>
+        <w:t xml:space="preserve">             Download the Global Superstore Dataset.xlsx file and save it in the experiment folder.</w:t>
+      </w:r>
+    </w:p>
+    <w:p>
+      <w:pPr>
+        <w:pStyle w:val="ListParagraph"/>
+        <w:rPr>
+          <w:rFonts w:ascii="Times New Roman" w:hAnsi="Times New Roman" w:cs="Times New Roman"/>
+          <w:sz w:val="26"/>
+          <w:szCs w:val="26"/>
+        </w:rPr>
+      </w:pPr>
+      <w:r>
+        <w:rPr>
+          <w:rFonts w:ascii="Times New Roman" w:hAnsi="Times New Roman" w:cs="Times New Roman"/>
           <w:b/>
           <w:bCs/>
           <w:sz w:val="26"/>
@@ -715,6 +813,7 @@
       </w:r>
       <w:r>
         <w:rPr>
+          <w:rFonts w:ascii="Times New Roman" w:hAnsi="Times New Roman" w:cs="Times New Roman"/>
           <w:sz w:val="26"/>
           <w:szCs w:val="26"/>
         </w:rPr>
@@ -725,58 +824,50 @@
       <w:pPr>
         <w:pStyle w:val="ListParagraph"/>
         <w:rPr>
-          <w:sz w:val="26"/>
-          <w:szCs w:val="26"/>
-        </w:rPr>
-      </w:pPr>
-      <w:r>
-        <w:rPr>
-          <w:sz w:val="26"/>
-          <w:szCs w:val="26"/>
-        </w:rPr>
-        <w:t xml:space="preserve">             </w:t>
-      </w:r>
-      <w:r>
-        <w:rPr>
-          <w:sz w:val="26"/>
-          <w:szCs w:val="26"/>
-        </w:rPr>
-        <w:t>Home &gt; Get Data &gt; Excel Workbook</w:t>
-      </w:r>
-    </w:p>
-    <w:p>
-      <w:pPr>
-        <w:pStyle w:val="ListParagraph"/>
-        <w:rPr>
-          <w:sz w:val="26"/>
-          <w:szCs w:val="26"/>
-        </w:rPr>
-      </w:pPr>
-      <w:r>
-        <w:rPr>
-          <w:sz w:val="26"/>
-          <w:szCs w:val="26"/>
-        </w:rPr>
-        <w:t xml:space="preserve">             </w:t>
-      </w:r>
-      <w:r>
-        <w:rPr>
-          <w:sz w:val="26"/>
-          <w:szCs w:val="26"/>
-        </w:rPr>
-        <w:t>Select Global Superstore Dataset.xlsx &gt; Transform Data</w:t>
-      </w:r>
-    </w:p>
-    <w:p>
-      <w:pPr>
-        <w:pStyle w:val="ListParagraph"/>
-        <w:rPr>
-          <w:sz w:val="26"/>
-          <w:szCs w:val="26"/>
-        </w:rPr>
-      </w:pPr>
-      <w:r>
-        <w:rPr>
+          <w:rFonts w:ascii="Times New Roman" w:hAnsi="Times New Roman" w:cs="Times New Roman"/>
+          <w:sz w:val="26"/>
+          <w:szCs w:val="26"/>
+        </w:rPr>
+      </w:pPr>
+      <w:r>
+        <w:rPr>
+          <w:rFonts w:ascii="Times New Roman" w:hAnsi="Times New Roman" w:cs="Times New Roman"/>
+          <w:sz w:val="26"/>
+          <w:szCs w:val="26"/>
+        </w:rPr>
+        <w:t xml:space="preserve">             Home &gt; Get Data &gt; Excel Workbook</w:t>
+      </w:r>
+    </w:p>
+    <w:p>
+      <w:pPr>
+        <w:pStyle w:val="ListParagraph"/>
+        <w:rPr>
+          <w:rFonts w:ascii="Times New Roman" w:hAnsi="Times New Roman" w:cs="Times New Roman"/>
+          <w:sz w:val="26"/>
+          <w:szCs w:val="26"/>
+        </w:rPr>
+      </w:pPr>
+      <w:r>
+        <w:rPr>
+          <w:rFonts w:ascii="Times New Roman" w:hAnsi="Times New Roman" w:cs="Times New Roman"/>
+          <w:sz w:val="26"/>
+          <w:szCs w:val="26"/>
+        </w:rPr>
+        <w:t xml:space="preserve">             Select Global Superstore Dataset.xlsx &gt; Transform Data</w:t>
+      </w:r>
+    </w:p>
+    <w:p>
+      <w:pPr>
+        <w:pStyle w:val="ListParagraph"/>
+        <w:rPr>
+          <w:rFonts w:ascii="Times New Roman" w:hAnsi="Times New Roman" w:cs="Times New Roman"/>
+          <w:sz w:val="26"/>
+          <w:szCs w:val="26"/>
+        </w:rPr>
+      </w:pPr>
+      <w:r>
+        <w:rPr>
+          <w:rFonts w:ascii="Times New Roman" w:hAnsi="Times New Roman" w:cs="Times New Roman"/>
           <w:b/>
           <w:bCs/>
           <w:sz w:val="26"/>
@@ -786,6 +877,7 @@
       </w:r>
       <w:r>
         <w:rPr>
+          <w:rFonts w:ascii="Times New Roman" w:hAnsi="Times New Roman" w:cs="Times New Roman"/>
           <w:sz w:val="26"/>
           <w:szCs w:val="26"/>
         </w:rPr>
@@ -796,23 +888,18 @@
       <w:pPr>
         <w:pStyle w:val="ListParagraph"/>
         <w:rPr>
-          <w:sz w:val="26"/>
-          <w:szCs w:val="26"/>
-        </w:rPr>
-      </w:pPr>
-      <w:r>
-        <w:rPr>
-          <w:sz w:val="26"/>
-          <w:szCs w:val="26"/>
-        </w:rPr>
-        <w:t xml:space="preserve">             </w:t>
-      </w:r>
-      <w:r>
-        <w:rPr>
-          <w:sz w:val="26"/>
-          <w:szCs w:val="26"/>
-        </w:rPr>
-        <w:t>Select the following worksheets:</w:t>
+          <w:rFonts w:ascii="Times New Roman" w:hAnsi="Times New Roman" w:cs="Times New Roman"/>
+          <w:sz w:val="26"/>
+          <w:szCs w:val="26"/>
+        </w:rPr>
+      </w:pPr>
+      <w:r>
+        <w:rPr>
+          <w:rFonts w:ascii="Times New Roman" w:hAnsi="Times New Roman" w:cs="Times New Roman"/>
+          <w:sz w:val="26"/>
+          <w:szCs w:val="26"/>
+        </w:rPr>
+        <w:t xml:space="preserve">             Select the following worksheets:</w:t>
       </w:r>
     </w:p>
     <w:p>
@@ -824,12 +911,14 @@
         </w:numPr>
         <w:ind w:left="1944"/>
         <w:rPr>
-          <w:sz w:val="26"/>
-          <w:szCs w:val="26"/>
-        </w:rPr>
-      </w:pPr>
-      <w:r>
-        <w:rPr>
+          <w:rFonts w:ascii="Times New Roman" w:hAnsi="Times New Roman" w:cs="Times New Roman"/>
+          <w:sz w:val="26"/>
+          <w:szCs w:val="26"/>
+        </w:rPr>
+      </w:pPr>
+      <w:r>
+        <w:rPr>
+          <w:rFonts w:ascii="Times New Roman" w:hAnsi="Times New Roman" w:cs="Times New Roman"/>
           <w:sz w:val="26"/>
           <w:szCs w:val="26"/>
         </w:rPr>
@@ -845,12 +934,14 @@
         </w:numPr>
         <w:ind w:left="1944"/>
         <w:rPr>
-          <w:sz w:val="26"/>
-          <w:szCs w:val="26"/>
-        </w:rPr>
-      </w:pPr>
-      <w:r>
-        <w:rPr>
+          <w:rFonts w:ascii="Times New Roman" w:hAnsi="Times New Roman" w:cs="Times New Roman"/>
+          <w:sz w:val="26"/>
+          <w:szCs w:val="26"/>
+        </w:rPr>
+      </w:pPr>
+      <w:r>
+        <w:rPr>
+          <w:rFonts w:ascii="Times New Roman" w:hAnsi="Times New Roman" w:cs="Times New Roman"/>
           <w:sz w:val="26"/>
           <w:szCs w:val="26"/>
         </w:rPr>
@@ -866,12 +957,14 @@
         </w:numPr>
         <w:ind w:left="1944"/>
         <w:rPr>
-          <w:sz w:val="26"/>
-          <w:szCs w:val="26"/>
-        </w:rPr>
-      </w:pPr>
-      <w:r>
-        <w:rPr>
+          <w:rFonts w:ascii="Times New Roman" w:hAnsi="Times New Roman" w:cs="Times New Roman"/>
+          <w:sz w:val="26"/>
+          <w:szCs w:val="26"/>
+        </w:rPr>
+      </w:pPr>
+      <w:r>
+        <w:rPr>
+          <w:rFonts w:ascii="Times New Roman" w:hAnsi="Times New Roman" w:cs="Times New Roman"/>
           <w:sz w:val="26"/>
           <w:szCs w:val="26"/>
         </w:rPr>
@@ -882,12 +975,14 @@
       <w:pPr>
         <w:pStyle w:val="ListParagraph"/>
         <w:rPr>
-          <w:sz w:val="26"/>
-          <w:szCs w:val="26"/>
-        </w:rPr>
-      </w:pPr>
-      <w:r>
-        <w:rPr>
+          <w:rFonts w:ascii="Times New Roman" w:hAnsi="Times New Roman" w:cs="Times New Roman"/>
+          <w:sz w:val="26"/>
+          <w:szCs w:val="26"/>
+        </w:rPr>
+      </w:pPr>
+      <w:r>
+        <w:rPr>
+          <w:rFonts w:ascii="Times New Roman" w:hAnsi="Times New Roman" w:cs="Times New Roman"/>
           <w:sz w:val="26"/>
           <w:szCs w:val="26"/>
         </w:rPr>
@@ -895,6 +990,7 @@
       </w:r>
       <w:r>
         <w:rPr>
+          <w:rFonts w:ascii="Times New Roman" w:hAnsi="Times New Roman" w:cs="Times New Roman"/>
           <w:sz w:val="26"/>
           <w:szCs w:val="26"/>
         </w:rPr>
@@ -905,6 +1001,7 @@
       <w:pPr>
         <w:pStyle w:val="ListParagraph"/>
         <w:rPr>
+          <w:rFonts w:ascii="Times New Roman" w:hAnsi="Times New Roman" w:cs="Times New Roman"/>
           <w:b/>
           <w:bCs/>
           <w:sz w:val="26"/>
@@ -913,6 +1010,7 @@
       </w:pPr>
       <w:r>
         <w:rPr>
+          <w:rFonts w:ascii="Times New Roman" w:hAnsi="Times New Roman" w:cs="Times New Roman"/>
           <w:b/>
           <w:bCs/>
           <w:sz w:val="26"/>
@@ -925,12 +1023,14 @@
       <w:pPr>
         <w:pStyle w:val="ListParagraph"/>
         <w:rPr>
-          <w:sz w:val="26"/>
-          <w:szCs w:val="26"/>
-        </w:rPr>
-      </w:pPr>
-      <w:r>
-        <w:rPr>
+          <w:rFonts w:ascii="Times New Roman" w:hAnsi="Times New Roman" w:cs="Times New Roman"/>
+          <w:sz w:val="26"/>
+          <w:szCs w:val="26"/>
+        </w:rPr>
+      </w:pPr>
+      <w:r>
+        <w:rPr>
+          <w:rFonts w:ascii="Times New Roman" w:hAnsi="Times New Roman" w:cs="Times New Roman"/>
           <w:b/>
           <w:bCs/>
           <w:sz w:val="26"/>
@@ -940,6 +1040,7 @@
       </w:r>
       <w:r>
         <w:rPr>
+          <w:rFonts w:ascii="Times New Roman" w:hAnsi="Times New Roman" w:cs="Times New Roman"/>
           <w:sz w:val="26"/>
           <w:szCs w:val="26"/>
         </w:rPr>
@@ -950,12 +1051,14 @@
       <w:pPr>
         <w:pStyle w:val="ListParagraph"/>
         <w:rPr>
-          <w:sz w:val="26"/>
-          <w:szCs w:val="26"/>
-        </w:rPr>
-      </w:pPr>
-      <w:r>
-        <w:rPr>
+          <w:rFonts w:ascii="Times New Roman" w:hAnsi="Times New Roman" w:cs="Times New Roman"/>
+          <w:sz w:val="26"/>
+          <w:szCs w:val="26"/>
+        </w:rPr>
+      </w:pPr>
+      <w:r>
+        <w:rPr>
+          <w:rFonts w:ascii="Times New Roman" w:hAnsi="Times New Roman" w:cs="Times New Roman"/>
           <w:sz w:val="26"/>
           <w:szCs w:val="26"/>
         </w:rPr>
@@ -963,6 +1066,7 @@
       </w:r>
       <w:r>
         <w:rPr>
+          <w:rFonts w:ascii="Times New Roman" w:hAnsi="Times New Roman" w:cs="Times New Roman"/>
           <w:sz w:val="26"/>
           <w:szCs w:val="26"/>
         </w:rPr>
@@ -973,12 +1077,14 @@
       <w:pPr>
         <w:pStyle w:val="ListParagraph"/>
         <w:rPr>
-          <w:sz w:val="26"/>
-          <w:szCs w:val="26"/>
-        </w:rPr>
-      </w:pPr>
-      <w:r>
-        <w:rPr>
+          <w:rFonts w:ascii="Times New Roman" w:hAnsi="Times New Roman" w:cs="Times New Roman"/>
+          <w:sz w:val="26"/>
+          <w:szCs w:val="26"/>
+        </w:rPr>
+      </w:pPr>
+      <w:r>
+        <w:rPr>
+          <w:rFonts w:ascii="Times New Roman" w:hAnsi="Times New Roman" w:cs="Times New Roman"/>
           <w:sz w:val="26"/>
           <w:szCs w:val="26"/>
         </w:rPr>
@@ -986,6 +1092,7 @@
       </w:r>
       <w:r>
         <w:rPr>
+          <w:rFonts w:ascii="Times New Roman" w:hAnsi="Times New Roman" w:cs="Times New Roman"/>
           <w:sz w:val="26"/>
           <w:szCs w:val="26"/>
         </w:rPr>
@@ -996,12 +1103,14 @@
       <w:pPr>
         <w:pStyle w:val="ListParagraph"/>
         <w:rPr>
-          <w:sz w:val="26"/>
-          <w:szCs w:val="26"/>
-        </w:rPr>
-      </w:pPr>
-      <w:r>
-        <w:rPr>
+          <w:rFonts w:ascii="Times New Roman" w:hAnsi="Times New Roman" w:cs="Times New Roman"/>
+          <w:sz w:val="26"/>
+          <w:szCs w:val="26"/>
+        </w:rPr>
+      </w:pPr>
+      <w:r>
+        <w:rPr>
+          <w:rFonts w:ascii="Times New Roman" w:hAnsi="Times New Roman" w:cs="Times New Roman"/>
           <w:b/>
           <w:bCs/>
           <w:sz w:val="26"/>
@@ -1011,6 +1120,7 @@
       </w:r>
       <w:r>
         <w:rPr>
+          <w:rFonts w:ascii="Times New Roman" w:hAnsi="Times New Roman" w:cs="Times New Roman"/>
           <w:sz w:val="26"/>
           <w:szCs w:val="26"/>
         </w:rPr>
@@ -1021,12 +1131,14 @@
       <w:pPr>
         <w:pStyle w:val="ListParagraph"/>
         <w:rPr>
-          <w:sz w:val="26"/>
-          <w:szCs w:val="26"/>
-        </w:rPr>
-      </w:pPr>
-      <w:r>
-        <w:rPr>
+          <w:rFonts w:ascii="Times New Roman" w:hAnsi="Times New Roman" w:cs="Times New Roman"/>
+          <w:sz w:val="26"/>
+          <w:szCs w:val="26"/>
+        </w:rPr>
+      </w:pPr>
+      <w:r>
+        <w:rPr>
+          <w:rFonts w:ascii="Times New Roman" w:hAnsi="Times New Roman" w:cs="Times New Roman"/>
           <w:sz w:val="26"/>
           <w:szCs w:val="26"/>
         </w:rPr>
@@ -1034,6 +1146,7 @@
       </w:r>
       <w:r>
         <w:rPr>
+          <w:rFonts w:ascii="Times New Roman" w:hAnsi="Times New Roman" w:cs="Times New Roman"/>
           <w:sz w:val="26"/>
           <w:szCs w:val="26"/>
         </w:rPr>
@@ -1049,12 +1162,14 @@
         </w:numPr>
         <w:ind w:left="1800"/>
         <w:rPr>
-          <w:sz w:val="26"/>
-          <w:szCs w:val="26"/>
-        </w:rPr>
-      </w:pPr>
-      <w:r>
-        <w:rPr>
+          <w:rFonts w:ascii="Times New Roman" w:hAnsi="Times New Roman" w:cs="Times New Roman"/>
+          <w:sz w:val="26"/>
+          <w:szCs w:val="26"/>
+        </w:rPr>
+      </w:pPr>
+      <w:r>
+        <w:rPr>
+          <w:rFonts w:ascii="Times New Roman" w:hAnsi="Times New Roman" w:cs="Times New Roman"/>
           <w:sz w:val="26"/>
           <w:szCs w:val="26"/>
         </w:rPr>
@@ -1070,12 +1185,14 @@
         </w:numPr>
         <w:ind w:left="1800"/>
         <w:rPr>
-          <w:sz w:val="26"/>
-          <w:szCs w:val="26"/>
-        </w:rPr>
-      </w:pPr>
-      <w:r>
-        <w:rPr>
+          <w:rFonts w:ascii="Times New Roman" w:hAnsi="Times New Roman" w:cs="Times New Roman"/>
+          <w:sz w:val="26"/>
+          <w:szCs w:val="26"/>
+        </w:rPr>
+      </w:pPr>
+      <w:r>
+        <w:rPr>
+          <w:rFonts w:ascii="Times New Roman" w:hAnsi="Times New Roman" w:cs="Times New Roman"/>
           <w:sz w:val="26"/>
           <w:szCs w:val="26"/>
         </w:rPr>
@@ -1091,12 +1208,14 @@
         </w:numPr>
         <w:ind w:left="1800"/>
         <w:rPr>
-          <w:sz w:val="26"/>
-          <w:szCs w:val="26"/>
-        </w:rPr>
-      </w:pPr>
-      <w:r>
-        <w:rPr>
+          <w:rFonts w:ascii="Times New Roman" w:hAnsi="Times New Roman" w:cs="Times New Roman"/>
+          <w:sz w:val="26"/>
+          <w:szCs w:val="26"/>
+        </w:rPr>
+      </w:pPr>
+      <w:r>
+        <w:rPr>
+          <w:rFonts w:ascii="Times New Roman" w:hAnsi="Times New Roman" w:cs="Times New Roman"/>
           <w:sz w:val="26"/>
           <w:szCs w:val="26"/>
         </w:rPr>
@@ -1112,12 +1231,14 @@
         </w:numPr>
         <w:ind w:left="1800"/>
         <w:rPr>
-          <w:sz w:val="26"/>
-          <w:szCs w:val="26"/>
-        </w:rPr>
-      </w:pPr>
-      <w:r>
-        <w:rPr>
+          <w:rFonts w:ascii="Times New Roman" w:hAnsi="Times New Roman" w:cs="Times New Roman"/>
+          <w:sz w:val="26"/>
+          <w:szCs w:val="26"/>
+        </w:rPr>
+      </w:pPr>
+      <w:r>
+        <w:rPr>
+          <w:rFonts w:ascii="Times New Roman" w:hAnsi="Times New Roman" w:cs="Times New Roman"/>
           <w:sz w:val="26"/>
           <w:szCs w:val="26"/>
         </w:rPr>
@@ -1133,12 +1254,14 @@
         </w:numPr>
         <w:ind w:left="1800"/>
         <w:rPr>
-          <w:sz w:val="26"/>
-          <w:szCs w:val="26"/>
-        </w:rPr>
-      </w:pPr>
-      <w:r>
-        <w:rPr>
+          <w:rFonts w:ascii="Times New Roman" w:hAnsi="Times New Roman" w:cs="Times New Roman"/>
+          <w:sz w:val="26"/>
+          <w:szCs w:val="26"/>
+        </w:rPr>
+      </w:pPr>
+      <w:r>
+        <w:rPr>
+          <w:rFonts w:ascii="Times New Roman" w:hAnsi="Times New Roman" w:cs="Times New Roman"/>
           <w:sz w:val="26"/>
           <w:szCs w:val="26"/>
         </w:rPr>
@@ -1154,12 +1277,14 @@
         </w:numPr>
         <w:ind w:left="1800"/>
         <w:rPr>
-          <w:sz w:val="26"/>
-          <w:szCs w:val="26"/>
-        </w:rPr>
-      </w:pPr>
-      <w:r>
-        <w:rPr>
+          <w:rFonts w:ascii="Times New Roman" w:hAnsi="Times New Roman" w:cs="Times New Roman"/>
+          <w:sz w:val="26"/>
+          <w:szCs w:val="26"/>
+        </w:rPr>
+      </w:pPr>
+      <w:r>
+        <w:rPr>
+          <w:rFonts w:ascii="Times New Roman" w:hAnsi="Times New Roman" w:cs="Times New Roman"/>
           <w:sz w:val="26"/>
           <w:szCs w:val="26"/>
         </w:rPr>
@@ -1175,12 +1300,14 @@
         </w:numPr>
         <w:ind w:left="1800"/>
         <w:rPr>
-          <w:sz w:val="26"/>
-          <w:szCs w:val="26"/>
-        </w:rPr>
-      </w:pPr>
-      <w:r>
-        <w:rPr>
+          <w:rFonts w:ascii="Times New Roman" w:hAnsi="Times New Roman" w:cs="Times New Roman"/>
+          <w:sz w:val="26"/>
+          <w:szCs w:val="26"/>
+        </w:rPr>
+      </w:pPr>
+      <w:r>
+        <w:rPr>
+          <w:rFonts w:ascii="Times New Roman" w:hAnsi="Times New Roman" w:cs="Times New Roman"/>
           <w:sz w:val="26"/>
           <w:szCs w:val="26"/>
         </w:rPr>
@@ -1191,12 +1318,14 @@
       <w:pPr>
         <w:pStyle w:val="ListParagraph"/>
         <w:rPr>
-          <w:sz w:val="26"/>
-          <w:szCs w:val="26"/>
-        </w:rPr>
-      </w:pPr>
-      <w:r>
-        <w:rPr>
+          <w:rFonts w:ascii="Times New Roman" w:hAnsi="Times New Roman" w:cs="Times New Roman"/>
+          <w:sz w:val="26"/>
+          <w:szCs w:val="26"/>
+        </w:rPr>
+      </w:pPr>
+      <w:r>
+        <w:rPr>
+          <w:rFonts w:ascii="Times New Roman" w:hAnsi="Times New Roman" w:cs="Times New Roman"/>
           <w:sz w:val="26"/>
           <w:szCs w:val="26"/>
         </w:rPr>
@@ -1204,6 +1333,7 @@
       </w:r>
       <w:r>
         <w:rPr>
+          <w:rFonts w:ascii="Times New Roman" w:hAnsi="Times New Roman" w:cs="Times New Roman"/>
           <w:sz w:val="26"/>
           <w:szCs w:val="26"/>
         </w:rPr>
@@ -1214,12 +1344,14 @@
       <w:pPr>
         <w:pStyle w:val="ListParagraph"/>
         <w:rPr>
-          <w:sz w:val="26"/>
-          <w:szCs w:val="26"/>
-        </w:rPr>
-      </w:pPr>
-      <w:r>
-        <w:rPr>
+          <w:rFonts w:ascii="Times New Roman" w:hAnsi="Times New Roman" w:cs="Times New Roman"/>
+          <w:sz w:val="26"/>
+          <w:szCs w:val="26"/>
+        </w:rPr>
+      </w:pPr>
+      <w:r>
+        <w:rPr>
+          <w:rFonts w:ascii="Times New Roman" w:hAnsi="Times New Roman" w:cs="Times New Roman"/>
           <w:b/>
           <w:bCs/>
           <w:sz w:val="26"/>
@@ -1229,6 +1361,7 @@
       </w:r>
       <w:r>
         <w:rPr>
+          <w:rFonts w:ascii="Times New Roman" w:hAnsi="Times New Roman" w:cs="Times New Roman"/>
           <w:sz w:val="26"/>
           <w:szCs w:val="26"/>
         </w:rPr>
@@ -1239,12 +1372,14 @@
       <w:pPr>
         <w:pStyle w:val="ListParagraph"/>
         <w:rPr>
-          <w:sz w:val="26"/>
-          <w:szCs w:val="26"/>
-        </w:rPr>
-      </w:pPr>
-      <w:r>
-        <w:rPr>
+          <w:rFonts w:ascii="Times New Roman" w:hAnsi="Times New Roman" w:cs="Times New Roman"/>
+          <w:sz w:val="26"/>
+          <w:szCs w:val="26"/>
+        </w:rPr>
+      </w:pPr>
+      <w:r>
+        <w:rPr>
+          <w:rFonts w:ascii="Times New Roman" w:hAnsi="Times New Roman" w:cs="Times New Roman"/>
           <w:sz w:val="26"/>
           <w:szCs w:val="26"/>
         </w:rPr>
@@ -1252,6 +1387,7 @@
       </w:r>
       <w:r>
         <w:rPr>
+          <w:rFonts w:ascii="Times New Roman" w:hAnsi="Times New Roman" w:cs="Times New Roman"/>
           <w:sz w:val="26"/>
           <w:szCs w:val="26"/>
         </w:rPr>
@@ -1267,12 +1403,14 @@
         </w:numPr>
         <w:ind w:left="1944"/>
         <w:rPr>
-          <w:sz w:val="26"/>
-          <w:szCs w:val="26"/>
-        </w:rPr>
-      </w:pPr>
-      <w:r>
-        <w:rPr>
+          <w:rFonts w:ascii="Times New Roman" w:hAnsi="Times New Roman" w:cs="Times New Roman"/>
+          <w:sz w:val="26"/>
+          <w:szCs w:val="26"/>
+        </w:rPr>
+      </w:pPr>
+      <w:r>
+        <w:rPr>
+          <w:rFonts w:ascii="Times New Roman" w:hAnsi="Times New Roman" w:cs="Times New Roman"/>
           <w:sz w:val="26"/>
           <w:szCs w:val="26"/>
         </w:rPr>
@@ -1288,12 +1426,14 @@
         </w:numPr>
         <w:ind w:left="1944"/>
         <w:rPr>
-          <w:sz w:val="26"/>
-          <w:szCs w:val="26"/>
-        </w:rPr>
-      </w:pPr>
-      <w:r>
-        <w:rPr>
+          <w:rFonts w:ascii="Times New Roman" w:hAnsi="Times New Roman" w:cs="Times New Roman"/>
+          <w:sz w:val="26"/>
+          <w:szCs w:val="26"/>
+        </w:rPr>
+      </w:pPr>
+      <w:r>
+        <w:rPr>
+          <w:rFonts w:ascii="Times New Roman" w:hAnsi="Times New Roman" w:cs="Times New Roman"/>
           <w:sz w:val="26"/>
           <w:szCs w:val="26"/>
         </w:rPr>
@@ -1309,12 +1449,14 @@
         </w:numPr>
         <w:ind w:left="1944"/>
         <w:rPr>
-          <w:sz w:val="26"/>
-          <w:szCs w:val="26"/>
-        </w:rPr>
-      </w:pPr>
-      <w:r>
-        <w:rPr>
+          <w:rFonts w:ascii="Times New Roman" w:hAnsi="Times New Roman" w:cs="Times New Roman"/>
+          <w:sz w:val="26"/>
+          <w:szCs w:val="26"/>
+        </w:rPr>
+      </w:pPr>
+      <w:r>
+        <w:rPr>
+          <w:rFonts w:ascii="Times New Roman" w:hAnsi="Times New Roman" w:cs="Times New Roman"/>
           <w:sz w:val="26"/>
           <w:szCs w:val="26"/>
         </w:rPr>
@@ -1325,12 +1467,14 @@
       <w:pPr>
         <w:pStyle w:val="ListParagraph"/>
         <w:rPr>
-          <w:sz w:val="26"/>
-          <w:szCs w:val="26"/>
-        </w:rPr>
-      </w:pPr>
-      <w:r>
-        <w:rPr>
+          <w:rFonts w:ascii="Times New Roman" w:hAnsi="Times New Roman" w:cs="Times New Roman"/>
+          <w:sz w:val="26"/>
+          <w:szCs w:val="26"/>
+        </w:rPr>
+      </w:pPr>
+      <w:r>
+        <w:rPr>
+          <w:rFonts w:ascii="Times New Roman" w:hAnsi="Times New Roman" w:cs="Times New Roman"/>
           <w:b/>
           <w:bCs/>
           <w:sz w:val="26"/>
@@ -1340,6 +1484,7 @@
       </w:r>
       <w:r>
         <w:rPr>
+          <w:rFonts w:ascii="Times New Roman" w:hAnsi="Times New Roman" w:cs="Times New Roman"/>
           <w:sz w:val="26"/>
           <w:szCs w:val="26"/>
         </w:rPr>
@@ -1350,12 +1495,14 @@
       <w:pPr>
         <w:pStyle w:val="ListParagraph"/>
         <w:rPr>
-          <w:sz w:val="26"/>
-          <w:szCs w:val="26"/>
-        </w:rPr>
-      </w:pPr>
-      <w:r>
-        <w:rPr>
+          <w:rFonts w:ascii="Times New Roman" w:hAnsi="Times New Roman" w:cs="Times New Roman"/>
+          <w:sz w:val="26"/>
+          <w:szCs w:val="26"/>
+        </w:rPr>
+      </w:pPr>
+      <w:r>
+        <w:rPr>
+          <w:rFonts w:ascii="Times New Roman" w:hAnsi="Times New Roman" w:cs="Times New Roman"/>
           <w:sz w:val="26"/>
           <w:szCs w:val="26"/>
         </w:rPr>
@@ -1363,6 +1510,7 @@
       </w:r>
       <w:r>
         <w:rPr>
+          <w:rFonts w:ascii="Times New Roman" w:hAnsi="Times New Roman" w:cs="Times New Roman"/>
           <w:sz w:val="26"/>
           <w:szCs w:val="26"/>
         </w:rPr>
@@ -1378,16 +1526,17 @@
         </w:numPr>
         <w:ind w:left="1944"/>
         <w:rPr>
-          <w:sz w:val="26"/>
-          <w:szCs w:val="26"/>
-        </w:rPr>
-      </w:pPr>
-      <w:r>
-        <w:rPr>
-          <w:sz w:val="26"/>
-          <w:szCs w:val="26"/>
-        </w:rPr>
-        <w:lastRenderedPageBreak/>
+          <w:rFonts w:ascii="Times New Roman" w:hAnsi="Times New Roman" w:cs="Times New Roman"/>
+          <w:sz w:val="26"/>
+          <w:szCs w:val="26"/>
+        </w:rPr>
+      </w:pPr>
+      <w:r>
+        <w:rPr>
+          <w:rFonts w:ascii="Times New Roman" w:hAnsi="Times New Roman" w:cs="Times New Roman"/>
+          <w:sz w:val="26"/>
+          <w:szCs w:val="26"/>
+        </w:rPr>
         <w:t xml:space="preserve">Validate regional assignments. </w:t>
       </w:r>
     </w:p>
@@ -1400,12 +1549,14 @@
         </w:numPr>
         <w:ind w:left="1944"/>
         <w:rPr>
-          <w:sz w:val="26"/>
-          <w:szCs w:val="26"/>
-        </w:rPr>
-      </w:pPr>
-      <w:r>
-        <w:rPr>
+          <w:rFonts w:ascii="Times New Roman" w:hAnsi="Times New Roman" w:cs="Times New Roman"/>
+          <w:sz w:val="26"/>
+          <w:szCs w:val="26"/>
+        </w:rPr>
+      </w:pPr>
+      <w:r>
+        <w:rPr>
+          <w:rFonts w:ascii="Times New Roman" w:hAnsi="Times New Roman" w:cs="Times New Roman"/>
           <w:sz w:val="26"/>
           <w:szCs w:val="26"/>
         </w:rPr>
@@ -1421,12 +1572,14 @@
         </w:numPr>
         <w:ind w:left="1944"/>
         <w:rPr>
-          <w:sz w:val="26"/>
-          <w:szCs w:val="26"/>
-        </w:rPr>
-      </w:pPr>
-      <w:r>
-        <w:rPr>
+          <w:rFonts w:ascii="Times New Roman" w:hAnsi="Times New Roman" w:cs="Times New Roman"/>
+          <w:sz w:val="26"/>
+          <w:szCs w:val="26"/>
+        </w:rPr>
+      </w:pPr>
+      <w:r>
+        <w:rPr>
+          <w:rFonts w:ascii="Times New Roman" w:hAnsi="Times New Roman" w:cs="Times New Roman"/>
           <w:sz w:val="26"/>
           <w:szCs w:val="26"/>
         </w:rPr>
@@ -1437,12 +1590,14 @@
       <w:pPr>
         <w:pStyle w:val="ListParagraph"/>
         <w:rPr>
-          <w:sz w:val="26"/>
-          <w:szCs w:val="26"/>
-        </w:rPr>
-      </w:pPr>
-      <w:r>
-        <w:rPr>
+          <w:rFonts w:ascii="Times New Roman" w:hAnsi="Times New Roman" w:cs="Times New Roman"/>
+          <w:sz w:val="26"/>
+          <w:szCs w:val="26"/>
+        </w:rPr>
+      </w:pPr>
+      <w:r>
+        <w:rPr>
+          <w:rFonts w:ascii="Times New Roman" w:hAnsi="Times New Roman" w:cs="Times New Roman"/>
           <w:b/>
           <w:bCs/>
           <w:sz w:val="26"/>
@@ -1452,6 +1607,7 @@
       </w:r>
       <w:r>
         <w:rPr>
+          <w:rFonts w:ascii="Times New Roman" w:hAnsi="Times New Roman" w:cs="Times New Roman"/>
           <w:sz w:val="26"/>
           <w:szCs w:val="26"/>
         </w:rPr>
@@ -1462,19 +1618,23 @@
       <w:pPr>
         <w:pStyle w:val="ListParagraph"/>
         <w:rPr>
-          <w:sz w:val="26"/>
-          <w:szCs w:val="26"/>
-        </w:rPr>
-      </w:pPr>
-      <w:r>
-        <w:rPr>
-          <w:sz w:val="26"/>
-          <w:szCs w:val="26"/>
-        </w:rPr>
+          <w:rFonts w:ascii="Times New Roman" w:hAnsi="Times New Roman" w:cs="Times New Roman"/>
+          <w:sz w:val="26"/>
+          <w:szCs w:val="26"/>
+        </w:rPr>
+      </w:pPr>
+      <w:r>
+        <w:rPr>
+          <w:rFonts w:ascii="Times New Roman" w:hAnsi="Times New Roman" w:cs="Times New Roman"/>
+          <w:sz w:val="26"/>
+          <w:szCs w:val="26"/>
+        </w:rPr>
+        <w:lastRenderedPageBreak/>
         <w:t xml:space="preserve">             </w:t>
       </w:r>
       <w:r>
         <w:rPr>
+          <w:rFonts w:ascii="Times New Roman" w:hAnsi="Times New Roman" w:cs="Times New Roman"/>
           <w:sz w:val="26"/>
           <w:szCs w:val="26"/>
         </w:rPr>
@@ -1485,12 +1645,14 @@
       <w:pPr>
         <w:pStyle w:val="ListParagraph"/>
         <w:rPr>
-          <w:sz w:val="26"/>
-          <w:szCs w:val="26"/>
-        </w:rPr>
-      </w:pPr>
-      <w:r>
-        <w:rPr>
+          <w:rFonts w:ascii="Times New Roman" w:hAnsi="Times New Roman" w:cs="Times New Roman"/>
+          <w:sz w:val="26"/>
+          <w:szCs w:val="26"/>
+        </w:rPr>
+      </w:pPr>
+      <w:r>
+        <w:rPr>
+          <w:rFonts w:ascii="Times New Roman" w:hAnsi="Times New Roman" w:cs="Times New Roman"/>
           <w:sz w:val="26"/>
           <w:szCs w:val="26"/>
         </w:rPr>
@@ -1498,6 +1660,7 @@
       </w:r>
       <w:r>
         <w:rPr>
+          <w:rFonts w:ascii="Times New Roman" w:hAnsi="Times New Roman" w:cs="Times New Roman"/>
           <w:sz w:val="26"/>
           <w:szCs w:val="26"/>
         </w:rPr>
@@ -1508,12 +1671,14 @@
       <w:pPr>
         <w:pStyle w:val="ListParagraph"/>
         <w:rPr>
-          <w:sz w:val="26"/>
-          <w:szCs w:val="26"/>
-        </w:rPr>
-      </w:pPr>
-      <w:r>
-        <w:rPr>
+          <w:rFonts w:ascii="Times New Roman" w:hAnsi="Times New Roman" w:cs="Times New Roman"/>
+          <w:sz w:val="26"/>
+          <w:szCs w:val="26"/>
+        </w:rPr>
+      </w:pPr>
+      <w:r>
+        <w:rPr>
+          <w:rFonts w:ascii="Times New Roman" w:hAnsi="Times New Roman" w:cs="Times New Roman"/>
           <w:sz w:val="26"/>
           <w:szCs w:val="26"/>
         </w:rPr>
@@ -1521,6 +1686,7 @@
       </w:r>
       <w:r>
         <w:rPr>
+          <w:rFonts w:ascii="Times New Roman" w:hAnsi="Times New Roman" w:cs="Times New Roman"/>
           <w:sz w:val="26"/>
           <w:szCs w:val="26"/>
         </w:rPr>
@@ -1531,12 +1697,14 @@
       <w:pPr>
         <w:pStyle w:val="ListParagraph"/>
         <w:rPr>
-          <w:sz w:val="26"/>
-          <w:szCs w:val="26"/>
-        </w:rPr>
-      </w:pPr>
-      <w:r>
-        <w:rPr>
+          <w:rFonts w:ascii="Times New Roman" w:hAnsi="Times New Roman" w:cs="Times New Roman"/>
+          <w:sz w:val="26"/>
+          <w:szCs w:val="26"/>
+        </w:rPr>
+      </w:pPr>
+      <w:r>
+        <w:rPr>
+          <w:rFonts w:ascii="Times New Roman" w:hAnsi="Times New Roman" w:cs="Times New Roman"/>
           <w:b/>
           <w:bCs/>
           <w:sz w:val="26"/>
@@ -1546,6 +1714,7 @@
       </w:r>
       <w:r>
         <w:rPr>
+          <w:rFonts w:ascii="Times New Roman" w:hAnsi="Times New Roman" w:cs="Times New Roman"/>
           <w:sz w:val="26"/>
           <w:szCs w:val="26"/>
         </w:rPr>
@@ -1556,12 +1725,14 @@
       <w:pPr>
         <w:pStyle w:val="ListParagraph"/>
         <w:rPr>
-          <w:sz w:val="26"/>
-          <w:szCs w:val="26"/>
-        </w:rPr>
-      </w:pPr>
-      <w:r>
-        <w:rPr>
+          <w:rFonts w:ascii="Times New Roman" w:hAnsi="Times New Roman" w:cs="Times New Roman"/>
+          <w:sz w:val="26"/>
+          <w:szCs w:val="26"/>
+        </w:rPr>
+      </w:pPr>
+      <w:r>
+        <w:rPr>
+          <w:rFonts w:ascii="Times New Roman" w:hAnsi="Times New Roman" w:cs="Times New Roman"/>
           <w:sz w:val="26"/>
           <w:szCs w:val="26"/>
         </w:rPr>
@@ -1569,6 +1740,7 @@
       </w:r>
       <w:r>
         <w:rPr>
+          <w:rFonts w:ascii="Times New Roman" w:hAnsi="Times New Roman" w:cs="Times New Roman"/>
           <w:sz w:val="26"/>
           <w:szCs w:val="26"/>
         </w:rPr>
@@ -1579,12 +1751,14 @@
       <w:pPr>
         <w:pStyle w:val="ListParagraph"/>
         <w:rPr>
-          <w:sz w:val="26"/>
-          <w:szCs w:val="26"/>
-        </w:rPr>
-      </w:pPr>
-      <w:r>
-        <w:rPr>
+          <w:rFonts w:ascii="Times New Roman" w:hAnsi="Times New Roman" w:cs="Times New Roman"/>
+          <w:sz w:val="26"/>
+          <w:szCs w:val="26"/>
+        </w:rPr>
+      </w:pPr>
+      <w:r>
+        <w:rPr>
+          <w:rFonts w:ascii="Times New Roman" w:hAnsi="Times New Roman" w:cs="Times New Roman"/>
           <w:sz w:val="26"/>
           <w:szCs w:val="26"/>
         </w:rPr>
@@ -1592,6 +1766,7 @@
       </w:r>
       <w:r>
         <w:rPr>
+          <w:rFonts w:ascii="Times New Roman" w:hAnsi="Times New Roman" w:cs="Times New Roman"/>
           <w:sz w:val="26"/>
           <w:szCs w:val="26"/>
         </w:rPr>
@@ -1602,12 +1777,14 @@
       <w:pPr>
         <w:pStyle w:val="ListParagraph"/>
         <w:rPr>
-          <w:sz w:val="26"/>
-          <w:szCs w:val="26"/>
-        </w:rPr>
-      </w:pPr>
-      <w:r>
-        <w:rPr>
+          <w:rFonts w:ascii="Times New Roman" w:hAnsi="Times New Roman" w:cs="Times New Roman"/>
+          <w:sz w:val="26"/>
+          <w:szCs w:val="26"/>
+        </w:rPr>
+      </w:pPr>
+      <w:r>
+        <w:rPr>
+          <w:rFonts w:ascii="Times New Roman" w:hAnsi="Times New Roman" w:cs="Times New Roman"/>
           <w:sz w:val="26"/>
           <w:szCs w:val="26"/>
         </w:rPr>
@@ -1615,6 +1792,7 @@
       </w:r>
       <w:r>
         <w:rPr>
+          <w:rFonts w:ascii="Times New Roman" w:hAnsi="Times New Roman" w:cs="Times New Roman"/>
           <w:sz w:val="26"/>
           <w:szCs w:val="26"/>
         </w:rPr>
@@ -1625,12 +1803,14 @@
       <w:pPr>
         <w:pStyle w:val="ListParagraph"/>
         <w:rPr>
-          <w:sz w:val="26"/>
-          <w:szCs w:val="26"/>
-        </w:rPr>
-      </w:pPr>
-      <w:r>
-        <w:rPr>
+          <w:rFonts w:ascii="Times New Roman" w:hAnsi="Times New Roman" w:cs="Times New Roman"/>
+          <w:sz w:val="26"/>
+          <w:szCs w:val="26"/>
+        </w:rPr>
+      </w:pPr>
+      <w:r>
+        <w:rPr>
+          <w:rFonts w:ascii="Times New Roman" w:hAnsi="Times New Roman" w:cs="Times New Roman"/>
           <w:sz w:val="26"/>
           <w:szCs w:val="26"/>
         </w:rPr>
@@ -1638,6 +1818,7 @@
       </w:r>
       <w:r>
         <w:rPr>
+          <w:rFonts w:ascii="Times New Roman" w:hAnsi="Times New Roman" w:cs="Times New Roman"/>
           <w:sz w:val="26"/>
           <w:szCs w:val="26"/>
         </w:rPr>
@@ -1648,6 +1829,7 @@
       <w:pPr>
         <w:pStyle w:val="ListParagraph"/>
         <w:rPr>
+          <w:rFonts w:ascii="Times New Roman" w:hAnsi="Times New Roman" w:cs="Times New Roman"/>
           <w:b/>
           <w:bCs/>
           <w:sz w:val="26"/>
@@ -1656,6 +1838,7 @@
       </w:pPr>
       <w:r>
         <w:rPr>
+          <w:rFonts w:ascii="Times New Roman" w:hAnsi="Times New Roman" w:cs="Times New Roman"/>
           <w:b/>
           <w:bCs/>
           <w:sz w:val="26"/>
@@ -1668,12 +1851,14 @@
       <w:pPr>
         <w:pStyle w:val="ListParagraph"/>
         <w:rPr>
-          <w:sz w:val="26"/>
-          <w:szCs w:val="26"/>
-        </w:rPr>
-      </w:pPr>
-      <w:r>
-        <w:rPr>
+          <w:rFonts w:ascii="Times New Roman" w:hAnsi="Times New Roman" w:cs="Times New Roman"/>
+          <w:sz w:val="26"/>
+          <w:szCs w:val="26"/>
+        </w:rPr>
+      </w:pPr>
+      <w:r>
+        <w:rPr>
+          <w:rFonts w:ascii="Times New Roman" w:hAnsi="Times New Roman" w:cs="Times New Roman"/>
           <w:b/>
           <w:bCs/>
           <w:sz w:val="26"/>
@@ -1683,6 +1868,7 @@
       </w:r>
       <w:r>
         <w:rPr>
+          <w:rFonts w:ascii="Times New Roman" w:hAnsi="Times New Roman" w:cs="Times New Roman"/>
           <w:sz w:val="26"/>
           <w:szCs w:val="26"/>
         </w:rPr>
@@ -1693,12 +1879,14 @@
       <w:pPr>
         <w:pStyle w:val="ListParagraph"/>
         <w:rPr>
-          <w:sz w:val="26"/>
-          <w:szCs w:val="26"/>
-        </w:rPr>
-      </w:pPr>
-      <w:r>
-        <w:rPr>
+          <w:rFonts w:ascii="Times New Roman" w:hAnsi="Times New Roman" w:cs="Times New Roman"/>
+          <w:sz w:val="26"/>
+          <w:szCs w:val="26"/>
+        </w:rPr>
+      </w:pPr>
+      <w:r>
+        <w:rPr>
+          <w:rFonts w:ascii="Times New Roman" w:hAnsi="Times New Roman" w:cs="Times New Roman"/>
           <w:sz w:val="26"/>
           <w:szCs w:val="26"/>
         </w:rPr>
@@ -1706,6 +1894,7 @@
       </w:r>
       <w:r>
         <w:rPr>
+          <w:rFonts w:ascii="Times New Roman" w:hAnsi="Times New Roman" w:cs="Times New Roman"/>
           <w:sz w:val="26"/>
           <w:szCs w:val="26"/>
         </w:rPr>
@@ -1716,12 +1905,14 @@
       <w:pPr>
         <w:pStyle w:val="ListParagraph"/>
         <w:rPr>
-          <w:sz w:val="26"/>
-          <w:szCs w:val="26"/>
-        </w:rPr>
-      </w:pPr>
-      <w:r>
-        <w:rPr>
+          <w:rFonts w:ascii="Times New Roman" w:hAnsi="Times New Roman" w:cs="Times New Roman"/>
+          <w:sz w:val="26"/>
+          <w:szCs w:val="26"/>
+        </w:rPr>
+      </w:pPr>
+      <w:r>
+        <w:rPr>
+          <w:rFonts w:ascii="Times New Roman" w:hAnsi="Times New Roman" w:cs="Times New Roman"/>
           <w:b/>
           <w:bCs/>
           <w:sz w:val="26"/>
@@ -1731,6 +1922,7 @@
       </w:r>
       <w:r>
         <w:rPr>
+          <w:rFonts w:ascii="Times New Roman" w:hAnsi="Times New Roman" w:cs="Times New Roman"/>
           <w:sz w:val="26"/>
           <w:szCs w:val="26"/>
         </w:rPr>
@@ -1741,12 +1933,14 @@
       <w:pPr>
         <w:pStyle w:val="ListParagraph"/>
         <w:rPr>
-          <w:sz w:val="26"/>
-          <w:szCs w:val="26"/>
-        </w:rPr>
-      </w:pPr>
-      <w:r>
-        <w:rPr>
+          <w:rFonts w:ascii="Times New Roman" w:hAnsi="Times New Roman" w:cs="Times New Roman"/>
+          <w:sz w:val="26"/>
+          <w:szCs w:val="26"/>
+        </w:rPr>
+      </w:pPr>
+      <w:r>
+        <w:rPr>
+          <w:rFonts w:ascii="Times New Roman" w:hAnsi="Times New Roman" w:cs="Times New Roman"/>
           <w:sz w:val="26"/>
           <w:szCs w:val="26"/>
         </w:rPr>
@@ -1754,6 +1948,7 @@
       </w:r>
       <w:r>
         <w:rPr>
+          <w:rFonts w:ascii="Times New Roman" w:hAnsi="Times New Roman" w:cs="Times New Roman"/>
           <w:sz w:val="26"/>
           <w:szCs w:val="26"/>
         </w:rPr>
@@ -1769,12 +1964,14 @@
         </w:numPr>
         <w:ind w:left="1944"/>
         <w:rPr>
-          <w:sz w:val="26"/>
-          <w:szCs w:val="26"/>
-        </w:rPr>
-      </w:pPr>
-      <w:r>
-        <w:rPr>
+          <w:rFonts w:ascii="Times New Roman" w:hAnsi="Times New Roman" w:cs="Times New Roman"/>
+          <w:sz w:val="26"/>
+          <w:szCs w:val="26"/>
+        </w:rPr>
+      </w:pPr>
+      <w:r>
+        <w:rPr>
+          <w:rFonts w:ascii="Times New Roman" w:hAnsi="Times New Roman" w:cs="Times New Roman"/>
           <w:sz w:val="26"/>
           <w:szCs w:val="26"/>
         </w:rPr>
@@ -1790,12 +1987,14 @@
         </w:numPr>
         <w:ind w:left="1944"/>
         <w:rPr>
-          <w:sz w:val="26"/>
-          <w:szCs w:val="26"/>
-        </w:rPr>
-      </w:pPr>
-      <w:r>
-        <w:rPr>
+          <w:rFonts w:ascii="Times New Roman" w:hAnsi="Times New Roman" w:cs="Times New Roman"/>
+          <w:sz w:val="26"/>
+          <w:szCs w:val="26"/>
+        </w:rPr>
+      </w:pPr>
+      <w:r>
+        <w:rPr>
+          <w:rFonts w:ascii="Times New Roman" w:hAnsi="Times New Roman" w:cs="Times New Roman"/>
           <w:sz w:val="26"/>
           <w:szCs w:val="26"/>
         </w:rPr>
@@ -1806,12 +2005,14 @@
       <w:pPr>
         <w:pStyle w:val="ListParagraph"/>
         <w:rPr>
-          <w:sz w:val="26"/>
-          <w:szCs w:val="26"/>
-        </w:rPr>
-      </w:pPr>
-      <w:r>
-        <w:rPr>
+          <w:rFonts w:ascii="Times New Roman" w:hAnsi="Times New Roman" w:cs="Times New Roman"/>
+          <w:sz w:val="26"/>
+          <w:szCs w:val="26"/>
+        </w:rPr>
+      </w:pPr>
+      <w:r>
+        <w:rPr>
+          <w:rFonts w:ascii="Times New Roman" w:hAnsi="Times New Roman" w:cs="Times New Roman"/>
           <w:sz w:val="26"/>
           <w:szCs w:val="26"/>
         </w:rPr>
@@ -1819,6 +2020,7 @@
       </w:r>
       <w:r>
         <w:rPr>
+          <w:rFonts w:ascii="Times New Roman" w:hAnsi="Times New Roman" w:cs="Times New Roman"/>
           <w:sz w:val="26"/>
           <w:szCs w:val="26"/>
         </w:rPr>
@@ -1829,12 +2031,14 @@
       <w:pPr>
         <w:pStyle w:val="ListParagraph"/>
         <w:rPr>
-          <w:sz w:val="26"/>
-          <w:szCs w:val="26"/>
-        </w:rPr>
-      </w:pPr>
-      <w:r>
-        <w:rPr>
+          <w:rFonts w:ascii="Times New Roman" w:hAnsi="Times New Roman" w:cs="Times New Roman"/>
+          <w:sz w:val="26"/>
+          <w:szCs w:val="26"/>
+        </w:rPr>
+      </w:pPr>
+      <w:r>
+        <w:rPr>
+          <w:rFonts w:ascii="Times New Roman" w:hAnsi="Times New Roman" w:cs="Times New Roman"/>
           <w:b/>
           <w:bCs/>
           <w:sz w:val="26"/>
@@ -1844,6 +2048,7 @@
       </w:r>
       <w:r>
         <w:rPr>
+          <w:rFonts w:ascii="Times New Roman" w:hAnsi="Times New Roman" w:cs="Times New Roman"/>
           <w:sz w:val="26"/>
           <w:szCs w:val="26"/>
         </w:rPr>
@@ -1851,6 +2056,7 @@
       </w:r>
       <w:r>
         <w:rPr>
+          <w:rFonts w:ascii="Times New Roman" w:hAnsi="Times New Roman" w:cs="Times New Roman"/>
           <w:sz w:val="26"/>
           <w:szCs w:val="26"/>
         </w:rPr>
@@ -1861,12 +2067,14 @@
       <w:pPr>
         <w:pStyle w:val="ListParagraph"/>
         <w:rPr>
-          <w:sz w:val="26"/>
-          <w:szCs w:val="26"/>
-        </w:rPr>
-      </w:pPr>
-      <w:r>
-        <w:rPr>
+          <w:rFonts w:ascii="Times New Roman" w:hAnsi="Times New Roman" w:cs="Times New Roman"/>
+          <w:sz w:val="26"/>
+          <w:szCs w:val="26"/>
+        </w:rPr>
+      </w:pPr>
+      <w:r>
+        <w:rPr>
+          <w:rFonts w:ascii="Times New Roman" w:hAnsi="Times New Roman" w:cs="Times New Roman"/>
           <w:sz w:val="26"/>
           <w:szCs w:val="26"/>
         </w:rPr>
@@ -1874,6 +2082,7 @@
       </w:r>
       <w:r>
         <w:rPr>
+          <w:rFonts w:ascii="Times New Roman" w:hAnsi="Times New Roman" w:cs="Times New Roman"/>
           <w:sz w:val="26"/>
           <w:szCs w:val="26"/>
         </w:rPr>
@@ -1889,12 +2098,14 @@
         </w:numPr>
         <w:ind w:left="1944"/>
         <w:rPr>
-          <w:sz w:val="26"/>
-          <w:szCs w:val="26"/>
-        </w:rPr>
-      </w:pPr>
-      <w:r>
-        <w:rPr>
+          <w:rFonts w:ascii="Times New Roman" w:hAnsi="Times New Roman" w:cs="Times New Roman"/>
+          <w:sz w:val="26"/>
+          <w:szCs w:val="26"/>
+        </w:rPr>
+      </w:pPr>
+      <w:r>
+        <w:rPr>
+          <w:rFonts w:ascii="Times New Roman" w:hAnsi="Times New Roman" w:cs="Times New Roman"/>
           <w:sz w:val="26"/>
           <w:szCs w:val="26"/>
         </w:rPr>
@@ -1910,12 +2121,14 @@
         </w:numPr>
         <w:ind w:left="1944"/>
         <w:rPr>
-          <w:sz w:val="26"/>
-          <w:szCs w:val="26"/>
-        </w:rPr>
-      </w:pPr>
-      <w:r>
-        <w:rPr>
+          <w:rFonts w:ascii="Times New Roman" w:hAnsi="Times New Roman" w:cs="Times New Roman"/>
+          <w:sz w:val="26"/>
+          <w:szCs w:val="26"/>
+        </w:rPr>
+      </w:pPr>
+      <w:r>
+        <w:rPr>
+          <w:rFonts w:ascii="Times New Roman" w:hAnsi="Times New Roman" w:cs="Times New Roman"/>
           <w:sz w:val="26"/>
           <w:szCs w:val="26"/>
         </w:rPr>
@@ -1931,12 +2144,14 @@
         </w:numPr>
         <w:ind w:left="1944"/>
         <w:rPr>
-          <w:sz w:val="26"/>
-          <w:szCs w:val="26"/>
-        </w:rPr>
-      </w:pPr>
-      <w:r>
-        <w:rPr>
+          <w:rFonts w:ascii="Times New Roman" w:hAnsi="Times New Roman" w:cs="Times New Roman"/>
+          <w:sz w:val="26"/>
+          <w:szCs w:val="26"/>
+        </w:rPr>
+      </w:pPr>
+      <w:r>
+        <w:rPr>
+          <w:rFonts w:ascii="Times New Roman" w:hAnsi="Times New Roman" w:cs="Times New Roman"/>
           <w:sz w:val="26"/>
           <w:szCs w:val="26"/>
         </w:rPr>
@@ -1952,12 +2167,14 @@
         </w:numPr>
         <w:ind w:left="1944"/>
         <w:rPr>
-          <w:sz w:val="26"/>
-          <w:szCs w:val="26"/>
-        </w:rPr>
-      </w:pPr>
-      <w:r>
-        <w:rPr>
+          <w:rFonts w:ascii="Times New Roman" w:hAnsi="Times New Roman" w:cs="Times New Roman"/>
+          <w:sz w:val="26"/>
+          <w:szCs w:val="26"/>
+        </w:rPr>
+      </w:pPr>
+      <w:r>
+        <w:rPr>
+          <w:rFonts w:ascii="Times New Roman" w:hAnsi="Times New Roman" w:cs="Times New Roman"/>
           <w:sz w:val="26"/>
           <w:szCs w:val="26"/>
         </w:rPr>
@@ -1968,12 +2185,14 @@
       <w:pPr>
         <w:pStyle w:val="ListParagraph"/>
         <w:rPr>
-          <w:sz w:val="26"/>
-          <w:szCs w:val="26"/>
-        </w:rPr>
-      </w:pPr>
-      <w:r>
-        <w:rPr>
+          <w:rFonts w:ascii="Times New Roman" w:hAnsi="Times New Roman" w:cs="Times New Roman"/>
+          <w:sz w:val="26"/>
+          <w:szCs w:val="26"/>
+        </w:rPr>
+      </w:pPr>
+      <w:r>
+        <w:rPr>
+          <w:rFonts w:ascii="Times New Roman" w:hAnsi="Times New Roman" w:cs="Times New Roman"/>
           <w:sz w:val="26"/>
           <w:szCs w:val="26"/>
         </w:rPr>
@@ -1981,6 +2200,7 @@
       </w:r>
       <w:r>
         <w:rPr>
+          <w:rFonts w:ascii="Times New Roman" w:hAnsi="Times New Roman" w:cs="Times New Roman"/>
           <w:sz w:val="26"/>
           <w:szCs w:val="26"/>
         </w:rPr>
@@ -1988,6 +2208,7 @@
       </w:r>
       <w:r>
         <w:rPr>
+          <w:rFonts w:ascii="Times New Roman" w:hAnsi="Times New Roman" w:cs="Times New Roman"/>
           <w:sz w:val="26"/>
           <w:szCs w:val="26"/>
         </w:rPr>
@@ -1995,6 +2216,7 @@
       </w:r>
       <w:r>
         <w:rPr>
+          <w:rFonts w:ascii="Times New Roman" w:hAnsi="Times New Roman" w:cs="Times New Roman"/>
           <w:color w:val="FFFFFF" w:themeColor="background1"/>
           <w:sz w:val="26"/>
           <w:szCs w:val="26"/>
@@ -2003,6 +2225,7 @@
       </w:r>
       <w:r>
         <w:rPr>
+          <w:rFonts w:ascii="Times New Roman" w:hAnsi="Times New Roman" w:cs="Times New Roman"/>
           <w:sz w:val="26"/>
           <w:szCs w:val="26"/>
         </w:rPr>
@@ -2010,6 +2233,7 @@
       </w:r>
       <w:r>
         <w:rPr>
+          <w:rFonts w:ascii="Times New Roman" w:hAnsi="Times New Roman" w:cs="Times New Roman"/>
           <w:sz w:val="26"/>
           <w:szCs w:val="26"/>
         </w:rPr>
@@ -2020,12 +2244,14 @@
       <w:pPr>
         <w:pStyle w:val="ListParagraph"/>
         <w:rPr>
-          <w:sz w:val="26"/>
-          <w:szCs w:val="26"/>
-        </w:rPr>
-      </w:pPr>
-      <w:r>
-        <w:rPr>
+          <w:rFonts w:ascii="Times New Roman" w:hAnsi="Times New Roman" w:cs="Times New Roman"/>
+          <w:sz w:val="26"/>
+          <w:szCs w:val="26"/>
+        </w:rPr>
+      </w:pPr>
+      <w:r>
+        <w:rPr>
+          <w:rFonts w:ascii="Times New Roman" w:hAnsi="Times New Roman" w:cs="Times New Roman"/>
           <w:b/>
           <w:bCs/>
           <w:sz w:val="26"/>
@@ -2035,6 +2261,7 @@
       </w:r>
       <w:r>
         <w:rPr>
+          <w:rFonts w:ascii="Times New Roman" w:hAnsi="Times New Roman" w:cs="Times New Roman"/>
           <w:sz w:val="26"/>
           <w:szCs w:val="26"/>
         </w:rPr>
@@ -2045,12 +2272,14 @@
       <w:pPr>
         <w:pStyle w:val="ListParagraph"/>
         <w:rPr>
-          <w:sz w:val="26"/>
-          <w:szCs w:val="26"/>
-        </w:rPr>
-      </w:pPr>
-      <w:r>
-        <w:rPr>
+          <w:rFonts w:ascii="Times New Roman" w:hAnsi="Times New Roman" w:cs="Times New Roman"/>
+          <w:sz w:val="26"/>
+          <w:szCs w:val="26"/>
+        </w:rPr>
+      </w:pPr>
+      <w:r>
+        <w:rPr>
+          <w:rFonts w:ascii="Times New Roman" w:hAnsi="Times New Roman" w:cs="Times New Roman"/>
           <w:sz w:val="26"/>
           <w:szCs w:val="26"/>
         </w:rPr>
@@ -2058,6 +2287,7 @@
       </w:r>
       <w:r>
         <w:rPr>
+          <w:rFonts w:ascii="Times New Roman" w:hAnsi="Times New Roman" w:cs="Times New Roman"/>
           <w:sz w:val="26"/>
           <w:szCs w:val="26"/>
         </w:rPr>
@@ -2068,12 +2298,14 @@
       <w:pPr>
         <w:pStyle w:val="ListParagraph"/>
         <w:rPr>
-          <w:sz w:val="26"/>
-          <w:szCs w:val="26"/>
-        </w:rPr>
-      </w:pPr>
-      <w:r>
-        <w:rPr>
+          <w:rFonts w:ascii="Times New Roman" w:hAnsi="Times New Roman" w:cs="Times New Roman"/>
+          <w:sz w:val="26"/>
+          <w:szCs w:val="26"/>
+        </w:rPr>
+      </w:pPr>
+      <w:r>
+        <w:rPr>
+          <w:rFonts w:ascii="Times New Roman" w:hAnsi="Times New Roman" w:cs="Times New Roman"/>
           <w:sz w:val="26"/>
           <w:szCs w:val="26"/>
         </w:rPr>
@@ -2081,6 +2313,7 @@
       </w:r>
       <w:r>
         <w:rPr>
+          <w:rFonts w:ascii="Times New Roman" w:hAnsi="Times New Roman" w:cs="Times New Roman"/>
           <w:sz w:val="26"/>
           <w:szCs w:val="26"/>
         </w:rPr>
@@ -2096,12 +2329,14 @@
         </w:numPr>
         <w:ind w:left="1944"/>
         <w:rPr>
-          <w:sz w:val="26"/>
-          <w:szCs w:val="26"/>
-        </w:rPr>
-      </w:pPr>
-      <w:r>
-        <w:rPr>
+          <w:rFonts w:ascii="Times New Roman" w:hAnsi="Times New Roman" w:cs="Times New Roman"/>
+          <w:sz w:val="26"/>
+          <w:szCs w:val="26"/>
+        </w:rPr>
+      </w:pPr>
+      <w:r>
+        <w:rPr>
+          <w:rFonts w:ascii="Times New Roman" w:hAnsi="Times New Roman" w:cs="Times New Roman"/>
           <w:sz w:val="26"/>
           <w:szCs w:val="26"/>
         </w:rPr>
@@ -2117,12 +2352,14 @@
         </w:numPr>
         <w:ind w:left="1944"/>
         <w:rPr>
-          <w:sz w:val="26"/>
-          <w:szCs w:val="26"/>
-        </w:rPr>
-      </w:pPr>
-      <w:r>
-        <w:rPr>
+          <w:rFonts w:ascii="Times New Roman" w:hAnsi="Times New Roman" w:cs="Times New Roman"/>
+          <w:sz w:val="26"/>
+          <w:szCs w:val="26"/>
+        </w:rPr>
+      </w:pPr>
+      <w:r>
+        <w:rPr>
+          <w:rFonts w:ascii="Times New Roman" w:hAnsi="Times New Roman" w:cs="Times New Roman"/>
           <w:sz w:val="26"/>
           <w:szCs w:val="26"/>
         </w:rPr>
@@ -2138,12 +2375,14 @@
         </w:numPr>
         <w:ind w:left="1944"/>
         <w:rPr>
-          <w:sz w:val="26"/>
-          <w:szCs w:val="26"/>
-        </w:rPr>
-      </w:pPr>
-      <w:r>
-        <w:rPr>
+          <w:rFonts w:ascii="Times New Roman" w:hAnsi="Times New Roman" w:cs="Times New Roman"/>
+          <w:sz w:val="26"/>
+          <w:szCs w:val="26"/>
+        </w:rPr>
+      </w:pPr>
+      <w:r>
+        <w:rPr>
+          <w:rFonts w:ascii="Times New Roman" w:hAnsi="Times New Roman" w:cs="Times New Roman"/>
           <w:sz w:val="26"/>
           <w:szCs w:val="26"/>
         </w:rPr>
@@ -2159,12 +2398,14 @@
         </w:numPr>
         <w:ind w:left="1944"/>
         <w:rPr>
-          <w:sz w:val="26"/>
-          <w:szCs w:val="26"/>
-        </w:rPr>
-      </w:pPr>
-      <w:r>
-        <w:rPr>
+          <w:rFonts w:ascii="Times New Roman" w:hAnsi="Times New Roman" w:cs="Times New Roman"/>
+          <w:sz w:val="26"/>
+          <w:szCs w:val="26"/>
+        </w:rPr>
+      </w:pPr>
+      <w:r>
+        <w:rPr>
+          <w:rFonts w:ascii="Times New Roman" w:hAnsi="Times New Roman" w:cs="Times New Roman"/>
           <w:sz w:val="26"/>
           <w:szCs w:val="26"/>
         </w:rPr>
@@ -2180,12 +2421,14 @@
         </w:numPr>
         <w:ind w:left="1944"/>
         <w:rPr>
-          <w:sz w:val="26"/>
-          <w:szCs w:val="26"/>
-        </w:rPr>
-      </w:pPr>
-      <w:r>
-        <w:rPr>
+          <w:rFonts w:ascii="Times New Roman" w:hAnsi="Times New Roman" w:cs="Times New Roman"/>
+          <w:sz w:val="26"/>
+          <w:szCs w:val="26"/>
+        </w:rPr>
+      </w:pPr>
+      <w:r>
+        <w:rPr>
+          <w:rFonts w:ascii="Times New Roman" w:hAnsi="Times New Roman" w:cs="Times New Roman"/>
           <w:sz w:val="26"/>
           <w:szCs w:val="26"/>
         </w:rPr>
@@ -2201,12 +2444,14 @@
         </w:numPr>
         <w:ind w:left="1944"/>
         <w:rPr>
-          <w:sz w:val="26"/>
-          <w:szCs w:val="26"/>
-        </w:rPr>
-      </w:pPr>
-      <w:r>
-        <w:rPr>
+          <w:rFonts w:ascii="Times New Roman" w:hAnsi="Times New Roman" w:cs="Times New Roman"/>
+          <w:sz w:val="26"/>
+          <w:szCs w:val="26"/>
+        </w:rPr>
+      </w:pPr>
+      <w:r>
+        <w:rPr>
+          <w:rFonts w:ascii="Times New Roman" w:hAnsi="Times New Roman" w:cs="Times New Roman"/>
           <w:sz w:val="26"/>
           <w:szCs w:val="26"/>
         </w:rPr>
@@ -2222,12 +2467,14 @@
         </w:numPr>
         <w:ind w:left="1944"/>
         <w:rPr>
-          <w:sz w:val="26"/>
-          <w:szCs w:val="26"/>
-        </w:rPr>
-      </w:pPr>
-      <w:r>
-        <w:rPr>
+          <w:rFonts w:ascii="Times New Roman" w:hAnsi="Times New Roman" w:cs="Times New Roman"/>
+          <w:sz w:val="26"/>
+          <w:szCs w:val="26"/>
+        </w:rPr>
+      </w:pPr>
+      <w:r>
+        <w:rPr>
+          <w:rFonts w:ascii="Times New Roman" w:hAnsi="Times New Roman" w:cs="Times New Roman"/>
           <w:sz w:val="26"/>
           <w:szCs w:val="26"/>
         </w:rPr>
@@ -2243,16 +2490,17 @@
         </w:numPr>
         <w:ind w:left="1944"/>
         <w:rPr>
-          <w:sz w:val="26"/>
-          <w:szCs w:val="26"/>
-        </w:rPr>
-      </w:pPr>
-      <w:r>
-        <w:rPr>
-          <w:sz w:val="26"/>
-          <w:szCs w:val="26"/>
-        </w:rPr>
-        <w:lastRenderedPageBreak/>
+          <w:rFonts w:ascii="Times New Roman" w:hAnsi="Times New Roman" w:cs="Times New Roman"/>
+          <w:sz w:val="26"/>
+          <w:szCs w:val="26"/>
+        </w:rPr>
+      </w:pPr>
+      <w:r>
+        <w:rPr>
+          <w:rFonts w:ascii="Times New Roman" w:hAnsi="Times New Roman" w:cs="Times New Roman"/>
+          <w:sz w:val="26"/>
+          <w:szCs w:val="26"/>
+        </w:rPr>
         <w:t xml:space="preserve">Detailed Sales &amp; Profit Analysis table </w:t>
       </w:r>
     </w:p>
@@ -2260,12 +2508,14 @@
       <w:pPr>
         <w:pStyle w:val="ListParagraph"/>
         <w:rPr>
-          <w:sz w:val="26"/>
-          <w:szCs w:val="26"/>
-        </w:rPr>
-      </w:pPr>
-      <w:r>
-        <w:rPr>
+          <w:rFonts w:ascii="Times New Roman" w:hAnsi="Times New Roman" w:cs="Times New Roman"/>
+          <w:sz w:val="26"/>
+          <w:szCs w:val="26"/>
+        </w:rPr>
+      </w:pPr>
+      <w:r>
+        <w:rPr>
+          <w:rFonts w:ascii="Times New Roman" w:hAnsi="Times New Roman" w:cs="Times New Roman"/>
           <w:sz w:val="26"/>
           <w:szCs w:val="26"/>
         </w:rPr>
@@ -2273,6 +2523,7 @@
       </w:r>
       <w:r>
         <w:rPr>
+          <w:rFonts w:ascii="Times New Roman" w:hAnsi="Times New Roman" w:cs="Times New Roman"/>
           <w:sz w:val="26"/>
           <w:szCs w:val="26"/>
         </w:rPr>
@@ -2283,12 +2534,14 @@
       <w:pPr>
         <w:pStyle w:val="ListParagraph"/>
         <w:rPr>
-          <w:sz w:val="26"/>
-          <w:szCs w:val="26"/>
-        </w:rPr>
-      </w:pPr>
-      <w:r>
-        <w:rPr>
+          <w:rFonts w:ascii="Times New Roman" w:hAnsi="Times New Roman" w:cs="Times New Roman"/>
+          <w:sz w:val="26"/>
+          <w:szCs w:val="26"/>
+        </w:rPr>
+      </w:pPr>
+      <w:r>
+        <w:rPr>
+          <w:rFonts w:ascii="Times New Roman" w:hAnsi="Times New Roman" w:cs="Times New Roman"/>
           <w:sz w:val="26"/>
           <w:szCs w:val="26"/>
         </w:rPr>
@@ -2296,6 +2549,7 @@
       </w:r>
       <w:r>
         <w:rPr>
+          <w:rFonts w:ascii="Times New Roman" w:hAnsi="Times New Roman" w:cs="Times New Roman"/>
           <w:sz w:val="26"/>
           <w:szCs w:val="26"/>
         </w:rPr>
@@ -2305,11 +2559,17 @@
     <w:p>
       <w:pPr>
         <w:pStyle w:val="ListParagraph"/>
-      </w:pPr>
-    </w:p>
-    <w:p>
-      <w:pPr>
-        <w:pStyle w:val="ListParagraph"/>
+        <w:rPr>
+          <w:rFonts w:ascii="Times New Roman" w:hAnsi="Times New Roman" w:cs="Times New Roman"/>
+        </w:rPr>
+      </w:pPr>
+    </w:p>
+    <w:p>
+      <w:pPr>
+        <w:pStyle w:val="ListParagraph"/>
+        <w:rPr>
+          <w:rFonts w:ascii="Times New Roman" w:hAnsi="Times New Roman" w:cs="Times New Roman"/>
+        </w:rPr>
       </w:pPr>
     </w:p>
     <w:p>
@@ -2320,6 +2580,7 @@
           <w:numId w:val="1"/>
         </w:numPr>
         <w:rPr>
+          <w:rFonts w:ascii="Times New Roman" w:hAnsi="Times New Roman" w:cs="Times New Roman"/>
           <w:b/>
           <w:bCs/>
           <w:sz w:val="28"/>
@@ -2328,6 +2589,7 @@
       </w:pPr>
       <w:r>
         <w:rPr>
+          <w:rFonts w:ascii="Times New Roman" w:hAnsi="Times New Roman" w:cs="Times New Roman"/>
           <w:b/>
           <w:bCs/>
           <w:sz w:val="28"/>
@@ -2339,16 +2601,30 @@
     <w:p>
       <w:pPr>
         <w:pStyle w:val="ListParagraph"/>
-      </w:pPr>
-      <w:r>
+        <w:rPr>
+          <w:rFonts w:ascii="Times New Roman" w:hAnsi="Times New Roman" w:cs="Times New Roman"/>
+        </w:rPr>
+      </w:pPr>
+      <w:r>
+        <w:rPr>
+          <w:rFonts w:ascii="Times New Roman" w:hAnsi="Times New Roman" w:cs="Times New Roman"/>
+        </w:rPr>
+        <w:lastRenderedPageBreak/>
         <w:t>Data was successfully extracted from the Global Superstore dataset, transformed using Power Query Editor, and loaded into the Power BI data model. Data cleaning, standardization, relationship creation, and DAX-based metric generation were performed successfully. The final dataset was prepared for reporting and business analysis.</w:t>
       </w:r>
     </w:p>
     <w:p>
       <w:pPr>
         <w:pStyle w:val="ListParagraph"/>
-      </w:pPr>
-      <w:r>
+        <w:rPr>
+          <w:rFonts w:ascii="Times New Roman" w:hAnsi="Times New Roman" w:cs="Times New Roman"/>
+        </w:rPr>
+      </w:pPr>
+      <w:r>
+        <w:rPr>
+          <w:rFonts w:ascii="Times New Roman" w:hAnsi="Times New Roman" w:cs="Times New Roman"/>
+          <w:noProof/>
+        </w:rPr>
         <w:drawing>
           <wp:inline distT="0" distB="0" distL="0" distR="0" wp14:anchorId="7F05FE49" wp14:editId="1A04C37C">
             <wp:extent cx="6858000" cy="3980815"/>
@@ -2391,12 +2667,14 @@
         <w:pStyle w:val="ListParagraph"/>
         <w:jc w:val="center"/>
         <w:rPr>
+          <w:rFonts w:ascii="Times New Roman" w:hAnsi="Times New Roman" w:cs="Times New Roman"/>
           <w:i/>
           <w:iCs/>
         </w:rPr>
       </w:pPr>
       <w:r>
         <w:rPr>
+          <w:rFonts w:ascii="Times New Roman" w:hAnsi="Times New Roman" w:cs="Times New Roman"/>
           <w:b/>
           <w:bCs/>
           <w:i/>
@@ -2406,6 +2684,7 @@
       </w:r>
       <w:r>
         <w:rPr>
+          <w:rFonts w:ascii="Times New Roman" w:hAnsi="Times New Roman" w:cs="Times New Roman"/>
           <w:i/>
           <w:iCs/>
         </w:rPr>
@@ -2415,12 +2694,16 @@
     <w:p>
       <w:pPr>
         <w:pStyle w:val="ListParagraph"/>
-      </w:pPr>
-    </w:p>
-    <w:p>
-      <w:pPr>
-        <w:pStyle w:val="ListParagraph"/>
-        <w:rPr>
+        <w:rPr>
+          <w:rFonts w:ascii="Times New Roman" w:hAnsi="Times New Roman" w:cs="Times New Roman"/>
+        </w:rPr>
+      </w:pPr>
+    </w:p>
+    <w:p>
+      <w:pPr>
+        <w:pStyle w:val="ListParagraph"/>
+        <w:rPr>
+          <w:rFonts w:ascii="Times New Roman" w:hAnsi="Times New Roman" w:cs="Times New Roman"/>
           <w:b/>
           <w:bCs/>
           <w:sz w:val="28"/>
@@ -2436,6 +2719,7 @@
           <w:numId w:val="1"/>
         </w:numPr>
         <w:rPr>
+          <w:rFonts w:ascii="Times New Roman" w:hAnsi="Times New Roman" w:cs="Times New Roman"/>
           <w:b/>
           <w:bCs/>
           <w:sz w:val="28"/>
@@ -2444,6 +2728,7 @@
       </w:pPr>
       <w:r>
         <w:rPr>
+          <w:rFonts w:ascii="Times New Roman" w:hAnsi="Times New Roman" w:cs="Times New Roman"/>
           <w:b/>
           <w:bCs/>
           <w:sz w:val="28"/>
@@ -2459,8 +2744,14 @@
           <w:ilvl w:val="0"/>
           <w:numId w:val="24"/>
         </w:numPr>
-      </w:pPr>
-      <w:r>
+        <w:rPr>
+          <w:rFonts w:ascii="Times New Roman" w:hAnsi="Times New Roman" w:cs="Times New Roman"/>
+        </w:rPr>
+      </w:pPr>
+      <w:r>
+        <w:rPr>
+          <w:rFonts w:ascii="Times New Roman" w:hAnsi="Times New Roman" w:cs="Times New Roman"/>
+        </w:rPr>
         <w:t>Understood the ETL process and its role in Business Intelligence.</w:t>
       </w:r>
     </w:p>
@@ -2471,8 +2762,14 @@
           <w:ilvl w:val="0"/>
           <w:numId w:val="24"/>
         </w:numPr>
-      </w:pPr>
-      <w:r>
+        <w:rPr>
+          <w:rFonts w:ascii="Times New Roman" w:hAnsi="Times New Roman" w:cs="Times New Roman"/>
+        </w:rPr>
+      </w:pPr>
+      <w:r>
+        <w:rPr>
+          <w:rFonts w:ascii="Times New Roman" w:hAnsi="Times New Roman" w:cs="Times New Roman"/>
+        </w:rPr>
         <w:t>Learned how to extract data from a real-world business dataset using Power BI.</w:t>
       </w:r>
     </w:p>
@@ -2483,8 +2780,14 @@
           <w:ilvl w:val="0"/>
           <w:numId w:val="24"/>
         </w:numPr>
-      </w:pPr>
-      <w:r>
+        <w:rPr>
+          <w:rFonts w:ascii="Times New Roman" w:hAnsi="Times New Roman" w:cs="Times New Roman"/>
+        </w:rPr>
+      </w:pPr>
+      <w:r>
+        <w:rPr>
+          <w:rFonts w:ascii="Times New Roman" w:hAnsi="Times New Roman" w:cs="Times New Roman"/>
+        </w:rPr>
         <w:t>Gained practical experience with Power Query Editor.</w:t>
       </w:r>
     </w:p>
@@ -2495,8 +2798,14 @@
           <w:ilvl w:val="0"/>
           <w:numId w:val="24"/>
         </w:numPr>
-      </w:pPr>
-      <w:r>
+        <w:rPr>
+          <w:rFonts w:ascii="Times New Roman" w:hAnsi="Times New Roman" w:cs="Times New Roman"/>
+        </w:rPr>
+      </w:pPr>
+      <w:r>
+        <w:rPr>
+          <w:rFonts w:ascii="Times New Roman" w:hAnsi="Times New Roman" w:cs="Times New Roman"/>
+        </w:rPr>
         <w:t>Learned how to clean, filter, transform, and merge datasets.</w:t>
       </w:r>
     </w:p>
@@ -2507,8 +2816,14 @@
           <w:ilvl w:val="0"/>
           <w:numId w:val="24"/>
         </w:numPr>
-      </w:pPr>
-      <w:r>
+        <w:rPr>
+          <w:rFonts w:ascii="Times New Roman" w:hAnsi="Times New Roman" w:cs="Times New Roman"/>
+        </w:rPr>
+      </w:pPr>
+      <w:r>
+        <w:rPr>
+          <w:rFonts w:ascii="Times New Roman" w:hAnsi="Times New Roman" w:cs="Times New Roman"/>
+        </w:rPr>
         <w:t>Learned how to handle duplicate records, blank values, and data type inconsistencies.</w:t>
       </w:r>
     </w:p>
@@ -2519,8 +2834,14 @@
           <w:ilvl w:val="0"/>
           <w:numId w:val="24"/>
         </w:numPr>
-      </w:pPr>
-      <w:r>
+        <w:rPr>
+          <w:rFonts w:ascii="Times New Roman" w:hAnsi="Times New Roman" w:cs="Times New Roman"/>
+        </w:rPr>
+      </w:pPr>
+      <w:r>
+        <w:rPr>
+          <w:rFonts w:ascii="Times New Roman" w:hAnsi="Times New Roman" w:cs="Times New Roman"/>
+        </w:rPr>
         <w:t>Learned how to create relationships between multiple tables in Power BI.</w:t>
       </w:r>
     </w:p>
@@ -2531,8 +2852,14 @@
           <w:ilvl w:val="0"/>
           <w:numId w:val="24"/>
         </w:numPr>
-      </w:pPr>
-      <w:r>
+        <w:rPr>
+          <w:rFonts w:ascii="Times New Roman" w:hAnsi="Times New Roman" w:cs="Times New Roman"/>
+        </w:rPr>
+      </w:pPr>
+      <w:r>
+        <w:rPr>
+          <w:rFonts w:ascii="Times New Roman" w:hAnsi="Times New Roman" w:cs="Times New Roman"/>
+        </w:rPr>
         <w:t>Learned how to create analytical measures using DAX.</w:t>
       </w:r>
     </w:p>
@@ -2543,8 +2870,14 @@
           <w:ilvl w:val="0"/>
           <w:numId w:val="24"/>
         </w:numPr>
-      </w:pPr>
-      <w:r>
+        <w:rPr>
+          <w:rFonts w:ascii="Times New Roman" w:hAnsi="Times New Roman" w:cs="Times New Roman"/>
+        </w:rPr>
+      </w:pPr>
+      <w:r>
+        <w:rPr>
+          <w:rFonts w:ascii="Times New Roman" w:hAnsi="Times New Roman" w:cs="Times New Roman"/>
+        </w:rPr>
         <w:t>Understood the use of Total Sales, Total Profit, Profit Margin, and Total Orders measures.</w:t>
       </w:r>
     </w:p>
@@ -2555,9 +2888,14 @@
           <w:ilvl w:val="0"/>
           <w:numId w:val="24"/>
         </w:numPr>
-      </w:pPr>
-      <w:r>
-        <w:lastRenderedPageBreak/>
+        <w:rPr>
+          <w:rFonts w:ascii="Times New Roman" w:hAnsi="Times New Roman" w:cs="Times New Roman"/>
+        </w:rPr>
+      </w:pPr>
+      <w:r>
+        <w:rPr>
+          <w:rFonts w:ascii="Times New Roman" w:hAnsi="Times New Roman" w:cs="Times New Roman"/>
+        </w:rPr>
         <w:t>Learned how to create BI visualizations and dashboards for business analysis.</w:t>
       </w:r>
     </w:p>
@@ -2569,6 +2907,7 @@
           <w:numId w:val="24"/>
         </w:numPr>
         <w:rPr>
+          <w:rFonts w:ascii="Times New Roman" w:hAnsi="Times New Roman" w:cs="Times New Roman"/>
           <w:b/>
           <w:bCs/>
           <w:sz w:val="28"/>
@@ -2576,10 +2915,19 @@
         </w:rPr>
       </w:pPr>
       <w:r>
+        <w:rPr>
+          <w:rFonts w:ascii="Times New Roman" w:hAnsi="Times New Roman" w:cs="Times New Roman"/>
+        </w:rPr>
         <w:t>Gained practical experience in preparing transformed data for reporting and decision-making.</w:t>
       </w:r>
     </w:p>
-    <w:p/>
+    <w:p>
+      <w:pPr>
+        <w:rPr>
+          <w:rFonts w:ascii="Times New Roman" w:hAnsi="Times New Roman" w:cs="Times New Roman"/>
+        </w:rPr>
+      </w:pPr>
+    </w:p>
     <w:sectPr>
       <w:pgSz w:w="12240" w:h="15840"/>
       <w:pgMar w:top="720" w:right="720" w:bottom="720" w:left="720" w:header="720" w:footer="720" w:gutter="0"/>

</xml_diff>